<commit_message>
Proofcheck Inn Trouble Polish: SIGNIFICANT (15 fixes)
Co-Authored-By: Claude Opus 5.5 <noreply@anthropic.com>
Claude-Session: https://claude.ai/code/session_012Cm8JxdqzjuttdUSdkQCUg
</commit_message>
<xml_diff>
--- a/translated/corrected/Inn Trouble - ASSEMBLED - FORMATTED_Polish.docx
+++ b/translated/corrected/Inn Trouble - ASSEMBLED - FORMATTED_Polish.docx
@@ -129,12 +129,12 @@
     </w:p>
     <w:p>
       <w:r>
-        <w:t>Gospoda Winter Wonderland Inn ogrzała już chyba połowę Frost Falls. Fiona Okafor prowadziła ją tak samo, jak jej rodzina od stu lat, a dzisiaj rano zapięła kardigan na opak i nie może oderwać oczu od drzwi.</w:t>
-      </w:r>
-    </w:p>
-    <w:p>
-      <w:r>
-        <w:t xml:space="preserve">Notatka żąda pół miliona dolarów. Nadawca wie, co jej prababcia zabrała Blackburnom w 1924 roku, zna sklep o dwa miasteczka stąd, w którym to sprzedała, i wymienia szafir w sercu broszy — szczegóły, które istnieją w dokładnie jednej zamkniętej na klucz skrzyni na strychu Fiony i w jeszcze jednym miejscu w miasteczku.</w:t>
+        <w:t xml:space="preserve">Gospoda Winter Wonderland Inn ogrzała już chyba połowę Frost Falls. Fiona Okafor prowadziła ją tak samo, jak jej rodzina od stu lat, a dzisiaj rano zapięła kardigan krzywo i nie może oderwać oczu od drzwi.</w:t>
+      </w:r>
+    </w:p>
+    <w:p>
+      <w:r>
+        <w:t xml:space="preserve">Notatka żąda pół miliona dolarów. Nadawca wie, co jej prababcia zabrała Blackburnom w 1924 roku, zna sklep o dwa miasteczka stąd, w którym to sprzedała, i wymienia kamień w sercu broszy — szczegóły, które istnieją w dokładnie jednej zamkniętej na klucz skrzyni na strychu Fiony i w jeszcze jednym miejscu w miasteczku.</w:t>
       </w:r>
     </w:p>
     <w:p>
@@ -185,7 +185,7 @@
     <w:p/>
     <w:p>
       <w:r>
-        <w:t xml:space="preserve">Uwielbiałam to. Pajęczyny pojawiły się wraz z pierwszym chłodnym rankiem, a ja spędziłam całe mnóstwo lat mojego długiego życia w miejscu, gdzie jedynymi sąsiadami były elfy i renifery, a mąż mruczał coś pod nosem w warsztacie, więc nigdy nie będę brać ulicy pełnej dyń za pewnik. Pan Kim wyrzeźbił cały rząd dyń przed warsztatem samochodowym, a każda nosiła małą papierową czapkę mechanika. W oknie redakcji gazety stał szkielet czytający gazetę. Ktoś — podejrzewałam Olivię — udziergał pomarańczową czapkę na hydrant przed Yarn Tales.</w:t>
+        <w:t xml:space="preserve">Uwielbiałam to. Pajęczyny pojawiły się wraz z pierwszym chłodnym rankiem, a ja spędziłam całe mnóstwo lat mojego długiego życia w miejscu, gdzie jedynymi sąsiadami były elfy i renifery, a mąż mruczał coś pod nosem w warsztacie, więc nigdy nie będę brać ulicy pełnej dyń za pewnik. Pan Kim wyrzeźbił cały rząd dyń przed warsztatem samochodowym, a każda nosiła małą papierową czapkę mechanika. W oknie redakcji Gazette stał szkielet czytający gazetę. Ktoś — podejrzewałam Olivię — udziergał pomarańczową czapkę na hydrant przed Yarn Tales.</w:t>
       </w:r>
     </w:p>
     <w:p/>
@@ -377,7 +377,7 @@
     <w:p/>
     <w:p>
       <w:r>
-        <w:t xml:space="preserve">— Claus. — Uśmiechnął się, a był to dobry uśmiech, swobodny i wyćwiczony, ale ufałam mu mniej więcej na tyle, na ile dałabym radę rzucić ekranem kominkowym. — A więc to pani jest tą sławną panią Claus. Jakże cudownie. Słyszałem oczywiście, człowiek wie o takich rzeczach, ale do tej pory nie do końca w to wierzyłem. — Pochylił się odrobinę, konfidencjonalnie. — Proszę mi powiedzieć. Czy dawne tutejsze rodziny, Blackburnowie i reszta, wciąż mają tu swoje rzeczy? Pamiątki rodzinne, meble, biżuterię, tego typu sprawy? Akurat poszukuję pewnego przedmiotu. Broszki.</w:t>
+        <w:t xml:space="preserve">— Claus. — Uśmiechnął się, a był to dobry uśmiech, swobodny i wyćwiczony, ale ufałam mu mniej więcej na tyle, na ile dałabym radę rzucić ekranem kominkowym. — A więc to pani jest tą sławną panią Claus. Jakże cudownie. Słyszałem oczywiście, człowiek wie o takich rzeczach, ale do tej pory nie do końca w to wierzyłem. — Pochylił się odrobinę, konfidencjonalnie. — Proszę mi powiedzieć. Czy dawne tutejsze rodziny, Blackburnowie i reszta, wciąż mają tu swoje rzeczy? Pamiątki rodzinne, meble, biżuterię, tego typu sprawy? Akurat poszukuję pewnego przedmiotu. Broszy.</w:t>
       </w:r>
     </w:p>
     <w:p/>
@@ -479,7 +479,7 @@
     <w:p/>
     <w:p>
       <w:r>
-        <w:t>To było nic. Luźny kabel. Figiel mrozu na zmęczonych oczach. Powtarzałam to sobie przez całą drogę powrotną w górę Evergreen Avenue, obok piekarni, gdzie poranny chleb roztaczał swój zapach po całym bloku, obok skweru z na wpół rozwieszonymi światełkami, obok gazeciarskiego szkieletu czytającego gazetę. Luźny kabelek. To wszystko.</w:t>
+        <w:t xml:space="preserve">To było nic. Luźny kabel. Figiel mrozu na zmęczonych oczach. Powtarzałam to sobie przez całą drogę powrotną w górę Evergreen Avenue, obok piekarni, gdzie poranny chleb roztaczał swój zapach po całym bloku, obok skweru z na wpół rozwieszonymi światełkami, obok czytającego gazetę szkieletu z okna Gazette. Luźny kabelek. To wszystko.</w:t>
       </w:r>
     </w:p>
     <w:p/>
@@ -2068,7 +2068,7 @@
     <w:p/>
     <w:p>
       <w:r>
-        <w:t xml:space="preserve">— Płacą mi za to. — Powiedział to wesoło, co mnie powstrzymało, bo szykowałam się na unik. — Badanie stanów prawnych spadków. To mój fach, pani Claus. Kiedy wymiera ostatni przedstawiciel starego, bogatego rodu, zostawia po sobie niezły bałagan: kłębowisko pytań o to, co do kogo należało, kto komu był coś winien, gdzie zapodziało się jakieś kosztowne cacko. Ktoś musi siedzieć w bibliotekach i rozplątywać ten węzeł gordyjski, a tym kimś jestem ja. — Rozłożył dłonie nad pudłami. — W tej właśnie chwili rozplątuję supły Blackburnów. Była w tej rodzinie pewna biżuteria. Broszka. Prawdziwe cacko. Z szafirem pośrodku, w oprawie z czystego złota, porządna rzecz, warta mnóstwo już wtedy, a dzisiaj wręcz fortunę. — Podniósł lupę, po czym odłożył ją z powrotem, a spod stołu Pip zerknęła jednym okiem na jej mosiężną obwódkę. — I nagle ślad po niej zniknął z rodzinnych rejestrów około tysiąc dziewięćset dwudziestego czwartego roku. Przestano o niej wspominać. Prawnicy rodziny bardzo chcieliby wiedzieć, gdzie się podziała, ponieważ nie da się porządnie zamknąć spadku, dopóki ktoś nie ustali, co stało się z tą broszą.</w:t>
+        <w:t xml:space="preserve">— Płacą mi za to. — Powiedział to wesoło, co mnie powstrzymało, bo szykowałam się na unik. — Badanie stanów prawnych spadków. To mój fach, pani Claus. Kiedy wymiera ostatni przedstawiciel starego, bogatego rodu, zostawia po sobie niezły bałagan: kłębowisko pytań o to, co do kogo należało, kto komu był coś winien, gdzie zapodziało się jakieś kosztowne cacko. Ktoś musi siedzieć w bibliotekach i rozplątywać ten węzeł gordyjski, a tym kimś jestem ja. — Rozłożył dłonie nad pudłami. — W tej właśnie chwili rozplątuję supły Blackburnów. Była w tej rodzinie pewna biżuteria. Brosza. Prawdziwe cacko. Z szafirem pośrodku, w oprawie z czystego złota, porządna rzecz, warta mnóstwo już wtedy, a dzisiaj wręcz fortunę. — Podniósł lupę, po czym odłożył ją z powrotem, a spod stołu Pip zerknęła jednym okiem na jej mosiężną obwódkę. — I nagle ślad po niej zniknął z rodzinnych rejestrów około tysiąc dziewięćset dwudziestego czwartego roku. Przestano o niej wspominać. Prawnicy rodziny bardzo chcieliby wiedzieć, gdzie się podziała, ponieważ nie da się porządnie zamknąć spadku, dopóki ktoś nie ustali, co stało się z tą broszą.</w:t>
       </w:r>
     </w:p>
     <w:p/>
@@ -3073,7 +3073,7 @@
     </w:p>
     <w:p>
       <w:r>
-        <w:t xml:space="preserve">— Jamal nosił pudła, ale żadnego nie otworzył — powiedziałam. — Sam mi to powiedział i wierzę mu. Cała jego kariera historyka sprowadzała się do zasady „ostrożnie, to jest cenne”. Przez cały tydzień dotykał sekretu tylko z zewnątrz i nigdy do niego nie zajrzał. A ten człowiek pracuje na trzy etaty, żeby uczciwie wyjść na prostą, prowadzi obóz kondycyjny o piątej trzydzieści rano i pilnuje festiwalu w nocy. To nie on. — Przekreśliłam imię Jamala zdecydowaną kreską. — Miał okazję, ale nie miał wiedzy. Zresztą nie miałby do tego serca, co dla mnie ma znaczenie, nawet jeśli nie przeszłoby to w sądzie.</w:t>
+        <w:t xml:space="preserve">— Jamal nosił pudła, ale żadnego nie otworzył — powiedziałam. — Sam mi to powiedział i wierzę mu. Cała jego wiedza historyczna sprowadzała się do zasady „ostrożnie, to jest cenne”. Przez cały tydzień dotykał sekretu tylko z zewnątrz i nigdy do niego nie zajrzał. A ten człowiek pracuje na trzy etaty, żeby uczciwie wyjść na prostą, prowadzi obóz kondycyjny o piątej trzydzieści rano i pilnuje festiwalu w nocy. To nie on. — Przekreśliłam imię Jamala zdecydowaną kreską. — Miał okazję, ale nie miał wiedzy. Zresztą nie miałby do tego serca, co dla mnie ma znaczenie, nawet jeśli nie przeszłoby to w sądzie.</w:t>
       </w:r>
     </w:p>
     <w:p>
@@ -3113,7 +3113,7 @@
     </w:p>
     <w:p>
       <w:r>
-        <w:t xml:space="preserve">— To jest ktoś, z kim nie potrafię dojść do ładu. Wiem, że wie wszystko to, co wie szantażysta. Broszka, pojedynczy kamień, Ridgeline — wszystko. Dotarł do tego od strony Blackburnów, od strony prawników spadkowych, i prześledził to niemal do drzwi Constance. — Obróciłam kubek na stole o powolne pół obrotu. — Ale on o tym opowiada wszystkim. Rozdaje wizytówki. Siedział w bibliotece publicznej i wyśpiewał mi to wszystko, zanim zdążyłam w ogóle zapytać. Szantażysta się ukrywa, Nick. Cała jego siła tkwi w ukryciu. A Neil Carter robi dokładnie na odwrót przez cały boży dzień. Więc albo wcale nie jest naszym człowiekiem, albo jest najsprytniejszym z całej paczki i robi wokół broszy tyle uczciwego szumu, że nikt w miasteczku nie spojrzałby dwa razy na człowieka, który mówi o niej najgłośniej. — Postawiłam znak zapytania obok Neila. — Nie jestem gotowa, żeby go skreślić. Ale powiem jedno. Zna sekret, wszedł w jego posiadanie uczciwie i nigdy nie zbliżył się do Fiony po ani centa. Podchodzi do niej po odpowiedzi, za dnia, z notesem w ręku.</w:t>
+        <w:t xml:space="preserve">— To jest ktoś, z kim nie potrafię dojść do ładu. Wiem, że wie wszystko to, co wie szantażysta. Brosza, pojedynczy kamień, Ridgeline — wszystko. Dotarł do tego od strony Blackburnów, od strony prawników spadkowych, i prześledził to niemal do drzwi Constance. — Obróciłam kubek na stole o powolne pół obrotu. — Ale on o tym opowiada wszystkim. Rozdaje wizytówki. Siedział w bibliotece publicznej i wyśpiewał mi to wszystko, zanim zdążyłam w ogóle zapytać. Szantażysta się ukrywa, Nick. Cała jego siła tkwi w ukryciu. A Neil Carter robi dokładnie na odwrót przez cały boży dzień. Więc albo wcale nie jest naszym człowiekiem, albo jest najsprytniejszym z całej paczki i robi wokół broszy tyle uczciwego szumu, że nikt w miasteczku nie spojrzałby dwa razy na człowieka, który mówi o niej najgłośniej. — Postawiłam znak zapytania obok Neila. — Nie jestem gotowa, żeby go skreślić. Ale powiem jedno. Zna sekret, wszedł w jego posiadanie uczciwie i nigdy nie zbliżył się do Fiony po ani centa. Podchodzi do niej po odpowiedzi, za dnia, z notesem w ręku.</w:t>
       </w:r>
     </w:p>
     <w:p>
@@ -3430,7 +3430,7 @@
         <w:rPr>
           <w:i/>
         </w:rPr>
-        <w:t xml:space="preserve">Korespondencja Adelaide Blackburn do jej siostry, zima 1924 r. Dotyczy kradzieży rodzinnej broszy (szafir w jej sercu) przez domową służbę; klejnot zastawiono później w Ridgeline. O dużym znaczeniu lokalnym.</w:t>
+        <w:t xml:space="preserve">Korespondencja Adelaide Blackburn do siostry, zima 1924 r. Dotyczy kradzieży rodzinnej broszy (szafir w jej sercu) przez domową służbę; klejnot zastawiono później w Ridgeline. O dużym znaczeniu lokalnym.</w:t>
       </w:r>
     </w:p>
     <w:p/>
@@ -3915,7 +3915,7 @@
     <w:p/>
     <w:p>
       <w:r>
-        <w:t xml:space="preserve">Oparłam się i pozwoliłam sobie wreszcie w to uwierzyć, w całości, w to, co odpychałam obiema rękami od tylu dni. Theo Hussein był szantażystą. Najżyczliwszym człowiekiem w całym Frost Falls. Człowiekiem, który trzymał mnie za ręce u drzwi wystawy ze zmęczonymi oczami lśniącymi nad czterdziestoma nowymi członkami. Odkrył historię broszy w swoim archiwum i dostrzegł w niej pół miliona dolarów, które mogły uratować tę jedną rzecz, jaką kochał bardziej niż własny spokój. Przełożył swój żal po umierającym Towarzystwie na cios wymierzony w przyjaciela.</w:t>
+        <w:t xml:space="preserve">Oparłam się i pozwoliłam sobie wreszcie w to uwierzyć, w całości, w to, co odpychałam obiema rękami od tylu dni. Theo Hussein był szantażystą. Najżyczliwszym człowiekiem w całym Frost Falls. Człowiekiem, który trzymał mnie za ręce u drzwi wystawy ze zmęczonymi oczami lśniącymi nad czterdziestoma nowymi członkami. Odkrył historię broszy w swoim archiwum i dostrzegł w niej pół miliona dolarów, które mogły uratować tę jedną rzecz, jaką kochał bardziej niż własny spokój. Przełożył swój żal po umierającym Towarzystwie na cios wymierzony w przyjaciółkę.</w:t>
       </w:r>
     </w:p>
     <w:p/>
@@ -4250,7 +4250,7 @@
     <w:p/>
     <w:p>
       <w:r>
-        <w:t xml:space="preserve">Szefowa Tanaka wysłuchała mnie w swoim małym biurze na komisariacie, z otwartym na biurku zużytym notesem i długopisem spoczywającym bez ruchu na stronie. Nie pisała w czasie, gdy decydowała, czy ma mi wierzyć. Wyłożyłam wszystko tak, jak wyłożyłam to sobie przy kuchennym stole. Te dwa liściki. Katalogową kartkę Theo z czterema pasującymi słowami. Papier listowy Towarzystwa, dopasowany pod lampą włókno do włókna. Akt własności gospody leżący poza szufladą w koszu na dokumenty Very. Constance, broszę, lombard w Ridgeline, całe stuletnie korzenie tej historii, a na samym dole teczkę Neila — tę część, która sprawiała, że te korzenie miały ludzki wymiar.</w:t>
+        <w:t xml:space="preserve">Szefowa Tanaka wysłuchała mnie w swoim małym biurze na komisariacie, z otwartym na biurku zużytym notesem i długopisem spoczywającym bez ruchu na stronie. Nie pisała w czasie, gdy decydowała, czy ma mi wierzyć. Wyłożyłam wszystko tak, jak wyłożyłam to sobie przy kuchennym stole. Te dwa liściki. Kartę katalogową Theo z czterema pasującymi słowami. Papeterię Towarzystwa, dopasowaną pod lampą włókno do włókna. Akt własności gospody leżący poza szufladą w koszu na dokumenty Very. Constance, broszę, lombard w Ridgeline, całe stuletnie korzenie tej historii, a na samym dole teczkę Neila — tę część, która sprawiała, że te korzenie miały ludzki wymiar.</w:t>
       </w:r>
     </w:p>
     <w:p/>
@@ -4506,7 +4506,7 @@
     <w:p/>
     <w:p>
       <w:r>
-        <w:t xml:space="preserve">— Pani Vero — powiedziałam. — Kradzież popełnił Theo. Ale liściki wiedziały, że gospoda została kupiona za pieniądze z broszy, a o tym nigdy nie było mowy w żadnym liście Blackburnów. To wpis w księgach. Akt własności. A akt własności tej gospody leżał wczoraj rano poza swoją szufladą w pani koszyku do ponownego porządkowania, dotknięty, na biurku kobiety, która dwukrotnie powtórzyła mi, że nigdy nie zagląda do dokumentów leżących za jej plecami.</w:t>
+        <w:t xml:space="preserve">— Pani Vero — powiedziałam. — Theo miał kradzież. Ale liściki wiedziały, że gospoda została kupiona za pieniądze z broszy, a o tym nigdy nie było mowy w żadnym liście Blackburnów. To rejestr nieruchomości. Akt własności. A akt własności tej gospody leżał wczoraj rano poza swoją szufladą w pani koszyku do ponownego porządkowania, dotknięty, na biurku kobiety, która dwukrotnie powtórzyła mi, że nigdy nie zagląda do dokumentów leżących za jej plecami.</w:t>
       </w:r>
     </w:p>
     <w:p/>
@@ -4518,7 +4518,7 @@
     <w:p/>
     <w:p>
       <w:r>
-        <w:t xml:space="preserve">— On dokonał kradzieży. Pani miała akt własności. I miała pani nogi, pani Vero. On nie przeszedłby przez miasteczko niezauważony choćby o życie, wszyscy znają Thea, wszyscy go zatrzymują. Ale nikt nie mrugnie okiem na sekretarkę burmistrza zachodzącą do gospody w czasie festiwalu. Minęłam panią wtedy rano na schodach, z pani przepustkami parkingowymi. On nie mógłby zrobić tego sam. Potrzebował kogoś, kto potrafi poruszać się po miasteczku niewidziany. Tą osobą była pani.</w:t>
+        <w:t xml:space="preserve">— On miał kradzież. Pani miała akt własności. I miała pani nogi, pani Vero. On nie przeszedłby przez miasteczko niezauważony choćby o życie, wszyscy znają Thea, wszyscy go zatrzymują. Ale nikt nie mrugnie okiem na sekretarkę burmistrza zachodzącą do gospody w czasie festiwalu. Minęłam panią wtedy rano na schodach, z pani przepustkami parkingowymi. On nie mógłby zrobić tego sam. Potrzebował kogoś, kto potrafi poruszać się po miasteczku niewidziany. Tą osobą była pani.</w:t>
       </w:r>
     </w:p>
     <w:p/>
@@ -4679,7 +4679,7 @@
     <w:p/>
     <w:p>
       <w:r>
-        <w:t>To powinien być koniec. Wciąż jednak pozostawała kwestia samego Towarzystwa — dokładnie tego miejsca, które Theo zrujnował, próbując je ratować. Nie było go już tam. Przez dach nadal przeciekał deszcz, piec grzewczy wciąż odmawiał posłuszeństwa, a żaden element tego całego rozrachunku nie przyniósł ani jednego dolara na rzecz naprawy czegokolwiek.</w:t>
+        <w:t xml:space="preserve">To powinien być koniec. Wciąż jednak pozostawała kwestia samego Towarzystwa — dokładnie tego, co Theo próbował ocalić, rujnując przy tym samego siebie. Nie było go już tam. Przez dach nadal przeciekał deszcz, piec grzewczy wciąż odmawiał posłuszeństwa, a żaden element tego całego rozrachunku nie przyniósł ani jednego dolara na rzecz naprawy czegokolwiek.</w:t>
       </w:r>
     </w:p>
     <w:p/>

</xml_diff>

<commit_message>
Full proofcheck Inn Trouble Polish: SIGNIFICANT (96 edits)
Co-Authored-By: Claude Opus 5.5 <noreply@anthropic.com>
Claude-Session: https://claude.ai/code/session_012Cm8JxdqzjuttdUSdkQCUg
</commit_message>
<xml_diff>
--- a/translated/corrected/Inn Trouble - ASSEMBLED - FORMATTED_Polish.docx
+++ b/translated/corrected/Inn Trouble - ASSEMBLED - FORMATTED_Polish.docx
@@ -129,7 +129,7 @@
     </w:p>
     <w:p>
       <w:r>
-        <w:t xml:space="preserve">Gospoda Winter Wonderland Inn ogrzała już chyba połowę Frost Falls. Fiona Okafor prowadziła ją tak samo, jak jej rodzina od stu lat, a dzisiaj rano zapięła kardigan krzywo i nie może oderwać oczu od drzwi.</w:t>
+        <w:t xml:space="preserve">Gospoda Winter Wonderland Inn ogrzała już chyba połowę Frost Falls. Fiona Okafor prowadzi ją tak samo, jak od stu lat prowadziła ją jej rodzina, a dzisiaj rano zapięła kardigan krzywo i nie może oderwać oczu od drzwi.</w:t>
       </w:r>
     </w:p>
     <w:p>
@@ -233,13 +233,13 @@
     <w:p/>
     <w:p>
       <w:r>
-        <w:t xml:space="preserve">Stała za recepcją, obracając długopis w palcach. Fiona była kobietą stworzoną do radości. Była krągła i szybka, szybka w ruchach i jeszcze szybsza do śmiechu, z takim śmiechem, który zaczynał się gdzieś głęboko i wybuchał od razu. Radość ulotniła się z niej jak ciepło z pokoju z otwartymi drzwiami. Pod jej oczami widniały cienie, których puder nie zdołał ukryć. Jej sweter był zapięty o jeden guzik za wysoko. Kiedy mnie zobaczyła, zrobiła to, co niepokoiło mnie bardziej niż cienie: ułożyła swoją twarz. Nałożyła powitanie, celowo, jak kobieta zakładająca płaszcz, którego noszeniem jest zbyt zmęczona, i podeszła do mnie zza biurka.</w:t>
-      </w:r>
-    </w:p>
-    <w:p/>
-    <w:p>
-      <w:r>
-        <w:t>— Jessica. — Nawet jej głos brzmiał fałszywie, cienki tam, gdzie powinien być ciepły. — Nie trzeba było.</w:t>
+        <w:t xml:space="preserve">Stała za recepcją, obracając długopis w palcach. Fiona była kobietą stworzoną do radości. Była krągła i szybka, szybka w ruchach i jeszcze szybsza do śmiechu, z takim śmiechem, który zaczynał się gdzieś głęboko i wybuchał od razu. Radość ulotniła się z niej jak ciepło z pokoju z otwartymi drzwiami. Pod jej oczami widniały cienie, których puder nie zdołał ukryć. Jej kardigan był zapięty krzywo, o jeden guzik. Kiedy mnie zobaczyła, zrobiła to, co niepokoiło mnie bardziej niż cienie: ułożyła swoją twarz. Nałożyła powitanie, celowo, jak kobieta zakładająca płaszcz, którego noszeniem jest zbyt zmęczona, i podeszła do mnie zza biurka.</w:t>
+      </w:r>
+    </w:p>
+    <w:p/>
+    <w:p>
+      <w:r>
+        <w:t xml:space="preserve">— Jessica. — Nawet jej głos brzmiał nie tak, cienki tam, gdzie powinien być ciepły. — Nie trzeba było.</w:t>
       </w:r>
     </w:p>
     <w:p/>
@@ -443,7 +443,7 @@
     <w:p/>
     <w:p>
       <w:r>
-        <w:t xml:space="preserve">Na zewnątrz chłód przyniósł ulgę po klaustrofobicznym, ciepłym niepokoju holu. Stałam przez chwilę przy balustradzie ganku i pozwoliłam mu przewietrzyć sobie głowę. Na skwerze mężczyźni na drabinach rozwieszali festiwalowe światełka między latarniami, wołając do siebie. Gdzieś w stronę parku szczekał pies, a pociąg wydał swój daleki gwizdek, wjeżdżając na stację. Wszystko to było tak zwyczajne, że fałsz na twarzy Fiony wydawał mi się na moment czymś, co sobie wyobraziłam.</w:t>
+        <w:t xml:space="preserve">Na zewnątrz chłód przyniósł ulgę po klaustrofobicznym, ciepłym niepokoju holu. Stałam przez chwilę przy balustradzie ganku i pozwoliłam mu przewietrzyć sobie głowę. Na skwerze mężczyźni na drabinach rozwieszali festiwalowe światełka między latarniami, wołając do siebie. Gdzieś w stronę parku szczekał pies, a pociąg wydał swój daleki gwizdek, wjeżdżając na stację. Wszystko to było tak zwyczajne, że to, co było nie tak w twarzy Fiony, wydawało mi się na moment czymś, co sobie wyobraziłam.</w:t>
       </w:r>
     </w:p>
     <w:p/>
@@ -598,7 +598,7 @@
     <w:p/>
     <w:p>
       <w:r>
-        <w:t>Fiona wyszła z bocznych drzwi, zanim doszłam do połowy, blada i z napiętą twarzą, dzisiaj z zapiętym równo kardiganem, ale ze wszystkim innym postawionym na głowę. Chwyciła mnie za ramię zimną dłonią i zaciągnęła do małego saloniku odchodzącego od holu, tego, który trzymała na prywatne rozmowy i popołudniową herbatę z przyjaciółmi. Zamknęła za nami drzwi, a stłumione odgłosy budzącej się gospody ucichły. Stojący w kącie zegar szafkowy tykał. Była to najgłośniejsza rzecz w pokoju.</w:t>
+        <w:t xml:space="preserve">Fiona wyszła z bocznych drzwi, zanim doszłam do połowy, blada i z napiętą twarzą, dzisiaj z zapiętym równo kardiganem, ale poza tym wszystko w niej było nie tak. Chwyciła mnie za ramię zimną dłonią i zaciągnęła do małego saloniku odchodzącego od holu, tego, który trzymała na prywatne rozmowy i popołudniową herbatę z przyjaciółmi. Zamknęła za nami drzwi, a stłumione odgłosy budzącej się gospody ucichły. Stojący w kącie zegar szafkowy tykał. Była to najgłośniejsza rzecz w pokoju.</w:t>
       </w:r>
     </w:p>
     <w:p/>
@@ -634,7 +634,7 @@
         <w:rPr>
           <w:i/>
         </w:rPr>
-        <w:t xml:space="preserve">Wiem, jak twoja rodzina weszła w posiadanie tej gospody. Wiem o broszy, którą twoja prababcia zabrała Blackburnom — szafir w jej sercu — i o sklepie w Ridgeline, w którym ją sprzedała, żeby kupić to miejsce. Zapłać albo całe miasteczko pozna prawdę. Zostaw pieniądze pod frontowymi schodami gospody. Zdejmij z wieńca złotą wstążkę i zawiąż w jej miejsce czerwoną, żebym wiedział, że pieniądze tam są.</w:t>
+        <w:t xml:space="preserve">Wiem, jak twoja rodzina weszła w posiadanie tej gospody. Wiem o broszy, którą twoja prababcia zabrała Blackburnom — szafir w jej sercu — i o sklepie w Ridgeline, w którym ją sprzedała, żeby kupić to miejsce. Zapłać albo całe miasteczko pozna prawdę. Zostaw pieniądze pod frontowymi schodami gospody. Zdejmij z wieńca złotą wstążkę i zawiąż w jej miejsce czerwoną na znak, że pieniądze tam są.</w:t>
       </w:r>
     </w:p>
     <w:p/>
@@ -783,7 +783,7 @@
     <w:p/>
     <w:p>
       <w:r>
-        <w:t>Podniosłam notatkę i przeczytałam ją jeszcze raz, tym razem uważniej, a kiedy zbliżyłam ją, by odczytać ciasny szlaczek pisma, z papieru uderzył zapach. Słaby, ale wyczuwalny. Ostry, lekko metaliczny, z czymś mineralnym w tle. Skądś go znałam, z czegoś niedawnego, i za nic w świecie nie mogłam sobie przypomnieć skąd.</w:t>
+        <w:t xml:space="preserve">Podniosłam notatkę i przeczytałam ją jeszcze raz, tym razem uważniej, a kiedy zbliżyłam ją, by odczytać ciasne gryzmoły, z papieru uderzył zapach. Słaby, ale wyczuwalny. Ostry, lekko metaliczny, z czymś mineralnym w tle. Skądś go znałam, z czegoś niedawnego, i za nic w świecie nie mogłam sobie przypomnieć skąd.</w:t>
       </w:r>
     </w:p>
     <w:p/>
@@ -830,7 +830,7 @@
     <w:p/>
     <w:p>
       <w:r>
-        <w:t>— Nie proszę cię jeszcze, żebyś w cokolwiek wierzyła w stosunku do kogokolwiek — powiedziałam łagodnie. — Pytam tylko, skąd mogła pochodzić ta wiedza. A są dwa miejsca, z czego jedno to kufr, który tylko ty możesz otworzyć. To nie jest oskarżenie. — Złożyłam notatkę wzdłuż jej wytartych zagięć, ostrożnie, i spojrzałam na nią. — Mogę to zatrzymać? Zarówno notatkę, jak i zdjęcie. Notatka może nam powiedzieć więcej, niż jej autor zamierzał.</w:t>
+        <w:t xml:space="preserve">— Nie proszę cię jeszcze, żebyś w cokolwiek wierzyła w stosunku do kogokolwiek — powiedziałam łagodnie. — Pytam tylko, skąd mogła pochodzić ta wiedza. A są dwa miejsca, z czego jedno to kufr, który tylko ty możesz otworzyć. To nie jest oskarżenie. — Złożyłam notatkę wzdłuż jej wytartych zagięć, ostrożnie, i spojrzałam na nią. — Mogę to zatrzymać? Zarówno notatkę, jak i zdjęcie. Notatka może nam powiedzieć więcej, niż miała zdradzić.</w:t>
       </w:r>
     </w:p>
     <w:p/>
@@ -945,7 +945,7 @@
     </w:p>
     <w:p>
       <w:r>
-        <w:t>Nick odłożył kubek, złączył dłonie i znów zamarł w bezruchu. Był to ciepły bezruch, przypominający uspokajającą się taflę stawu. Milczał, a kiedy przemówił ponownie, jego głos brzmiał ostrożnie.</w:t>
+        <w:t xml:space="preserve">Nick odłożył kubek, złączył dłonie i znów zamarł w bezruchu. Był to ciepły bezruch, przypominający uspokajającą się taflę stawu. Milczał i był smutny, a kiedy przemówił ponownie, jego głos brzmiał ostrożnie.</w:t>
       </w:r>
     </w:p>
     <w:p>
@@ -985,7 +985,7 @@
     </w:p>
     <w:p>
       <w:r>
-        <w:t>Pip obudziła się na dźwięk skrobnięcia garnka i podeszła do stołu w poszukiwaniu sardynki, co było jej odwiecznym i nienaruszalnym prawem. W kuchni zrobiło się cieplej. Przez chwilę byliśmy tylko we dwoje, ogień i para na szybie, i pozwoliłam, by na tym się skończyło.</w:t>
+        <w:t xml:space="preserve">Pip obudziła się na dźwięk skrobnięcia garnka i podeszła do stołu w poszukiwaniu sardynki, co było jej odwiecznym i nienaruszalnym prawem. W kuchni zrobiło się cieplej. Przez chwilę byliśmy tylko we dwoje, ogień i para na szybie, i pozwoliłam, żeby tak zostało.</w:t>
       </w:r>
     </w:p>
     <w:p>
@@ -1015,7 +1015,7 @@
     </w:p>
     <w:p>
       <w:r>
-        <w:t>— To prawda w przypadku bardzo wielu rzeczy — stwierdziłam — i ani razu w historii świata nie okazało się to prawdą w odniesieniu do budki dla ptaków, o której mi opowiadałeś w tygodniu, kiedy się tu wprowadziliśmy.</w:t>
+        <w:t xml:space="preserve">— To prawda w przypadku bardzo wielu rzeczy — stwierdziłam — i ani razu w historii świata nie okazało się to prawdą w odniesieniu do budki dla ptaków, a właśnie to mi powiedziałeś w tygodniu, kiedy się tu wprowadziliśmy.</w:t>
       </w:r>
     </w:p>
     <w:p>
@@ -1180,7 +1180,7 @@
     </w:p>
     <w:p>
       <w:r>
-        <w:t>Jamal Washington stał przy przeciwległej ścianie w samej koszuli z podwiniętymi rękawami, ocierając kark chustką, z miną człowieka, który wykonał całą czarną robotę, a teraz z przyzwyczajenia pełnił przy niej straż. Kiedy jakaś kobieta cofnęła się w stronę gabloty, wyciągnął dyskretnie rękę, by ją ustabilizować, zanim tamta zdążyła w nią uderzyć, po czym znów się oparł. To on to wszystko przywiózł. Każdą gablotę, każdą skrzynię.</w:t>
+        <w:t xml:space="preserve">Jamal Washington stał przy przeciwległej ścianie w samej koszuli z podwiniętymi rękawami, ocierając kark chustką, z miną człowieka, który wykonał całą czarną robotę, a teraz z przyzwyczajenia pełnił przy niej straż. Kiedy jakaś kobieta cofnęła się w stronę gabloty, wyciągnął dyskretnie rękę, by ją ustabilizować, zanim tamta zdążyła w nią uderzyć, po czym znów się oparł. To on to wszystko przeniósł. Każdą gablotę, każdą skrzynię.</w:t>
       </w:r>
     </w:p>
     <w:p>
@@ -1256,12 +1256,12 @@
     </w:p>
     <w:p>
       <w:r>
-        <w:t xml:space="preserve">Potem powoli lawirowałam między ludźmi. Podziwiałam stare akty własności z Dot, która skwitowała całą wystawę słowami „wielkie halo o cudzą korespondencję”, ale i tak została przez godzinę. Pozwoliłam Theo oprowadzić się po trzech gablotach i przyglądałam się, jakich dotykał — a raczej jak ich nie dotykał, bo jego palce zawisały nad szkłem każdej z nich niczym dłoń trzymana nad plecami śpiącego dziecka, by poczuć jego oddech bez budzenia go. Przez cały ten czas obserwowałam salę.</w:t>
-      </w:r>
-    </w:p>
-    <w:p>
-      <w:r>
-        <w:t>Papier w gablotach był stary, brązowy, kruchy na zgięciach. Ale na recepcji, obok płaskiego pudełka Very, leżał stos papieru firmowego Towarzystwa — czystych arkuszy używanych do etykiet i nagłówków, w kolorze kości słoniowej, nieco cięższych niż zwykły papier, z delikatną fakturą wybitą w jego strukturze, drobnymi równoległymi prążkami, które dało się zauważyć tylko pod światło albo wtedy, gdy człowiek wiedział, czego szukać.</w:t>
+        <w:t xml:space="preserve">Potem powoli lawirowałam między ludźmi. Podziwiałam stare akty własności z Dot, która skwitowała całą wystawę słowami „wielkie halo o cudzą korespondencję”, ale i tak została przez godzinę. Pozwoliłam Theo oprowadzić się po trzech gablotach i przyglądałam się, jak ich dotykał — a raczej jak ich nie dotykał, bo jego palce zawisały nad szkłem każdej z nich niczym dłoń trzymana nad plecami śpiącego dziecka, by poczuć jego oddech bez budzenia go. Przez cały ten czas obserwowałam salę.</w:t>
+      </w:r>
+    </w:p>
+    <w:p>
+      <w:r>
+        <w:t xml:space="preserve">Papier w gablotach był stary, brązowy, kruchy na zgięciach. Ale na recepcji, obok płaskiego pudełka Very, leżał stos papeterii Towarzystwa — czystych arkuszy używanych do etykiet i nagłówków, w kolorze kości słoniowej, nieco cięższych niż zwykły papier, z delikatną fakturą wybitą w jego strukturze, drobnymi równoległymi prążkami, które dało się zauważyć tylko pod światło albo wtedy, gdy człowiek wiedział, czego szukać.</w:t>
       </w:r>
     </w:p>
     <w:p>
@@ -1323,7 +1323,7 @@
         <w:t xml:space="preserve"/>
       </w:r>
       <w:r>
-        <w:t xml:space="preserve"> na rogu ulic Evergreen i Maple, a jego witryna była pełna motków ułożonych kolorami niczym otwarta paleta malarska. W środku było ciepło i zacisznie. Pachniało wełną oraz rumiankiem, który Olivia zawsze parzyła na małej grzałce stojącej na zapleczu za ladą. Tego popołudnia dziewiarski krąg przysunął krzesła bliżej przodu, w wodniste, październikowe światło padające z okna, i wszystkie tam były. Olivia w samym środku, oczywiście, bo to był jej sklep, jej rumianek i jakimś cudem zawsze jej rozmowa; obok niej Dot, krępa i siwa, sucha jak suchar; Claire z dziennikarską szybkością myślenia, o trzy rzędy robótki wyprzedzająca wszystkie pozostałe; Ivy, która śmiała się z rzeczy, zanim te na dobre stały się śmieszne; Martha, wyprostowana na wygodnym krześle ze skrzyżowanymi kostkami; oraz Ellie, delikatna Ellie, marszcząca brwi nad upuszczonym oczkiem.</w:t>
+        <w:t xml:space="preserve"> na rogu ulic Evergreen i Maple, a jego witryna była pełna motków ułożonych kolorami niczym otwarta paleta malarska. W środku było ciepło i panował półmrok. Pachniało wełną oraz rumiankiem, który Olivia zawsze parzyła na małej grzałce stojącej na zapleczu za ladą. Tego popołudnia dziewiarski krąg przysunął krzesła bliżej przodu, w wodniste, październikowe światło padające z okna, i wszystkie tam były. Olivia w samym środku, oczywiście, bo to był jej sklep, jej rumianek i jakimś cudem zawsze jej rozmowa; obok niej Dot, krępa i siwa, sucha jak suchar; Claire z dziennikarską szybkością myślenia, o trzy rzędy robótki wyprzedzająca wszystkie pozostałe; Ivy, która śmiała się z rzeczy, zanim te na dobre stały się śmieszne; Martha, wyprostowana na wygodnym krześle ze skrzyżowanymi kostkami; oraz Ellie, delikatna Ellie, marszcząca brwi nad upuszczonym oczkiem.</w:t>
       </w:r>
     </w:p>
     <w:p>
@@ -1338,7 +1338,7 @@
     </w:p>
     <w:p>
       <w:r>
-        <w:t>Rozmawiały o festiwalowych rękawiczkach — rękawiczkach z podpisanymi mankietami, które krąg robił na drutach co roku dla dzieci szkolnych, a każda para była dziergana w barwach szkoły z imieniem dziecka na mankiecie, aby żadna rękawiczka nigdy nie wróciła do domu z niewłaściwym właścicielem. Claire uniosła do światła na wpół ukończoną sztukę w kolorze jodłowej zieleni.</w:t>
+        <w:t xml:space="preserve">Pracowały nad festiwalowymi rękawiczkami — rękawiczkami z podpisanymi mankietami, które krąg robił na drutach co roku dla dzieci szkolnych, a każda para była dziergana w barwach szkoły z imieniem dziecka na mankiecie, aby żadna rękawiczka nigdy nie wróciła do domu z niewłaściwym właścicielem. Claire uniosła do światła na wpół ukończoną sztukę w kolorze jodłowej zieleni.</w:t>
       </w:r>
     </w:p>
     <w:p>
@@ -1403,7 +1403,7 @@
     </w:p>
     <w:p>
       <w:r>
-        <w:t>— A teraz obiecał festiwalowi cały pawilon z historią miasteczka — wtrąciła Claire — i akurat wiem, że nie ma pieniędzy na wynajęcie namiotu, nie mówiąc o całej reszcie, ponieważ pytałam go o to dla gazety, a on zmienił temat tak szybko, że prawie skręcił sobie kark.</w:t>
+        <w:t xml:space="preserve">— A teraz obiecał festiwalowi cały pawilon z historią miasteczka — wtrąciła Claire — i akurat wiem, że nie ma pieniędzy na wynajęcie namiotu, nie mówiąc o całej reszcie, ponieważ pytałam go o to dla Gazette, a on zmienił temat tak szybko, że prawie skręcił sobie kark.</w:t>
       </w:r>
     </w:p>
     <w:p>
@@ -1533,7 +1533,7 @@
     </w:p>
     <w:p>
       <w:r>
-        <w:t>Nie chciałam, żeby to był Theo. Wracając tamtego popołudnia do domu, z całego serca pragnęłam, by okazał się nim ktokolwiek inny na świecie.</w:t>
+        <w:t xml:space="preserve">Nie chciałam, żeby to był Theo. Wracając tamtego popołudnia do domu, z całego serca pragnęłam, by okazało się, że to ktokolwiek inny na świecie.</w:t>
       </w:r>
     </w:p>
     <w:p>
@@ -1673,7 +1673,7 @@
     <w:p/>
     <w:p>
       <w:r>
-        <w:t xml:space="preserve">Rękawiczki wciąż były w mojej torbie. Poszłam poszukać kogoś, kto zarządzał komitetem, i znalazłam szefową policji. Noriko Tanaka stała na środku skweru w parce i wełnianej czapce, trzymając w jednej ręce podkładkę z klipsem, a w drugiej kubek termiczny, i rozsyłała ludzi tam, gdzie byli potrzebni. Była krępą kobietą po pięćdziesiątce z siwizną na skroniach i wytartym notesem wystającym z kieszeni płaszcza. Olivia mówiła mi, że wróciła do domu po dwudziestu latach służby w policji stanowej, aby kierować sześcioosobowym posterunkiem, i że nikt w Frost Falls nigdy nie słyszał, by podniosła głos.</w:t>
+        <w:t xml:space="preserve">Rękawiczki wciąż były w mojej torbie. Poszłam poszukać kogoś, kto zarządzał komitetem, i znalazłam szefową policji. Noriko Tanaka stała na środku skweru w parce i wełnianej czapce, trzymając w jednej ręce podkładkę z klipsem, a w drugiej kubek termiczny, i rozsyłała ludzi tam, gdzie byli potrzebni. Była krępą kobietą około pięćdziesiątki z siwizną na skroniach i wytartym notesem wystającym z kieszeni płaszcza. Olivia mówiła mi, że wróciła do domu po dwudziestu latach służby w policji stanowej, aby kierować sześcioosobowym posterunkiem, i że nikt w Frost Falls nigdy nie słyszał, by podniosła głos.</w:t>
       </w:r>
     </w:p>
     <w:p/>
@@ -1757,7 +1757,7 @@
     <w:p/>
     <w:p>
       <w:r>
-        <w:t xml:space="preserve">Powinnam się martwić, a jakaś mała, ostrożna cząstka mnie faktycznie się martwiła. Reszta mnie kucnęła jednak w zimnej trawie z uzdrawiającą się dziewczynką, gałązką niemożliwego ostrokrzewu, psem w czapce z porożem i pingwinem z dynią na podbródku i wbrew wszystkiemu, co wiedziałam o byciu rozsądnym, czułam radość.</w:t>
+        <w:t xml:space="preserve">Powinnam była się martwić, a jakaś mała, ostrożna cząstka mnie faktycznie się martwiła. Reszta mnie kucnęła jednak w zimnej trawie z uzdrawiającą się dziewczynką, gałązką niemożliwego ostrokrzewu, psem w czapce z porożem i pingwinem z dynią na podbródku i wbrew wszystkiemu, co wiedziałam o byciu rozsądnym, czułam radość.</w:t>
       </w:r>
     </w:p>
     <w:p/>
@@ -1822,7 +1822,7 @@
     </w:p>
     <w:p>
       <w:r>
-        <w:t>Wyprowadziła mnie do przedpokoju, gdzie popołudniowe światło wpadało ukośnie przez nadświetle nad drzwiami i kładło się długim, złotym pasem na podłodze. Na ścianie przy schodach, w prostej ciemnej ramie, którą mijałam z tuzin razy, nawet na nią nie patrząc, wisiała fotografia. Kobieta w sukni z wysokim kołnierzem i gęsto sfalowanymi włosami sprzed wieku, z uniesionym podbródkiem, o ciemnych oczach spoglądających w obiektyw równie niezmiennie jak oczy kobiety z rodu Blackburnów na drugim zdjęciu, z tym samym powściągliwym wyrazem, choć na tej twarzy malował się on wyraźniej, z większym zmęczeniem i bliżej prawdy. Młodsza, niż ją sobie wyobrażałam. Młodsza niż kobieta ze zdjęcia szantażysty, która była panną Blackburn w całej swojej krasie. To była sama Constance, na tanim studyjnym krześle na tle namalowanego ogrodu, ubrana w swoje najlepsze szaty, które zresztą wiele nie kosztowały.</w:t>
+        <w:t xml:space="preserve">Wyprowadziła mnie do przedpokoju, gdzie popołudniowe światło wpadało ukośnie przez nadświetle nad drzwiami i kładło się długim, złotym pasem na podłodze. Na ścianie przy schodach, w prostej ciemnej ramie, którą mijałam z tuzin razy, nawet na nią nie patrząc, wisiała fotografia. Kobieta w sukni z wysokim kołnierzem i gęsto sfalowanymi włosami sprzed wieku, z uniesionym podbródkiem, o ciemnych oczach spoglądających w obiektyw równie niezmiennie jak oczy kobiety z rodu Blackburnów na drugim zdjęciu, z tym samym powściągliwym wyrazem, choć na tej twarzy malował się on wyraźniej, z większym zmęczeniem i bliżej prawdy. Młodsza, niż ją sobie wyobrażałam. Młodsza niż kobieta ze zdjęcia szantażysty, która była jedną z Blackburnów w całej swojej krasie. To była sama Constance, na tanim studyjnym krześle na tle namalowanego ogrodu, ubrana w swoje najlepsze szaty, które zresztą wiele nie kosztowały.</w:t>
       </w:r>
     </w:p>
     <w:p>
@@ -1837,7 +1837,7 @@
     </w:p>
     <w:p>
       <w:r>
-        <w:t xml:space="preserve">— Prowadziła gospodę przez czterdzieści lat — ciągnęła Fiona. — Wiedziałaś o tym? Czterdzieści lat. Moja prababcia. Wyszła za mąż późno, urodziła moją babcię późno i przez cały ten czas prowadziła ten dom i karmiła każdą duszę, która przyszła zziębnięta. Moja babcia opowiadała historię o tym, jak podczas jednej zimy pełnej grypy Constance przygarnęła trzy rodziny, które nie miały się gdzie podziać. Karmiła je ze swojej spiżarni aż do wiosny, nie biorąc ani centa i nigdy o tym nie wspominając. Taka kobieta z niej wyrastała. To właśnie zbudowała na fundamencie tego, co zrobiła. — Głos Fiony pociemniał. — A ja się jej wstydziłam. Tak się jej bałam. Podczas gdy prawda jest taka, że to najodważniejsza osoba, z jaką jestem spokrewniona, i że stworzyła to wszystko, to całe ciepło, z jednej strasznej, zdesperowanej zimy, a ja mogę w tym żyć i jedyne, co kiedykolwiek musiałam zrobić, to policzyć krzesła.</w:t>
+        <w:t xml:space="preserve">— Prowadziła gospodę przez czterdzieści lat — ciągnęła Fiona. — Wiedziałaś o tym? Czterdzieści lat. Moja prababcia. Wyszła za mąż późno, urodziła moją babcię późno i przez cały ten czas prowadziła ten dom i karmiła każdą duszę, która przyszła zziębnięta. Moja babcia opowiadała historię o tym, jak podczas jednej zimy pełnej grypy Constance przygarnęła trzy rodziny, które nie miały się gdzie podziać. Karmiła je ze swojej spiżarni aż do wiosny, nie biorąc ani centa i nigdy o tym nie wspominając. Taką kobietą się stała. To właśnie zbudowała na fundamencie tego, co zrobiła. — Głos Fiony nabrzmiał. — A ja się jej wstydziłam. Tak się jej bałam. Podczas gdy prawda jest taka, że to najodważniejsza osoba, z jaką jestem spokrewniona, i że stworzyła to wszystko, to całe ciepło, z jednej strasznej, zdesperowanej zimy, a ja mogę w tym żyć i jedyne, co kiedykolwiek musiałam zrobić, to policzyć krzesła.</w:t>
       </w:r>
     </w:p>
     <w:p>
@@ -1892,7 +1892,7 @@
     </w:p>
     <w:p>
       <w:r>
-        <w:t>Kuźnia stała na obrzeżach miasteczka, w miejscu, gdzie Evergreen Avenue przestawała być zwykłą ulicą i zamieniała się w drogę, jako ostatni budynek przed wzgórzami. Dźwięk jej pracy słyszało się na długo przed tym, jak ukazała się oczom — czysty i donośny odgłos uderzeń młota o żelazo, dźwięk o wyraźnym kształcie, który wznosił się i opadał. Pod nim krył się cichy pomruk ognia. Sam budynek, gdy w końcu pojawił się w polu widzenia, okazał się długą, niską wiatą, otwartą z jednej strony. Kiedy podeszłam do otwartego boksu, uderzyło mnie ciepło kuźni, które wdzierało się w październikowy chłód, a wraz z nim dotarł do mnie ten zapach.</w:t>
+        <w:t xml:space="preserve">Kuźnia stała na obrzeżach miasteczka, w miejscu, gdzie Evergreen Avenue przestawała być zwykłą ulicą i zamieniała się w drogę, jako ostatni budynek przed wzgórzami. Dźwięk jej pracy słyszało się na długo przed tym, jak ukazała się oczom — czysty i donośny odgłos uderzeń młota o żelazo, dźwięk o wyraźnym kształcie, który wznosił się i opadał. Pod nim krył się cichy pomruk ognia. Sam budynek, gdy w końcu pojawił się w polu widzenia, okazał się długą, niską wiatą, otwartą z jednej strony. Kiedy podeszłam od otwartej strony, uderzyło mnie ciepło kuźni, które wdzierało się w październikowy chłód, a wraz z nim dotarł do mnie ten zapach.</w:t>
       </w:r>
     </w:p>
     <w:p>
@@ -1902,7 +1902,7 @@
     </w:p>
     <w:p>
       <w:r>
-        <w:t xml:space="preserve">Sam Patel stał przy kowadle. W kleszczach trzymał płaską, żelazną gwiazdę, której jedno ramię świeciło pomarańczowym blaskiem w samym środku. Kował ją krótkimi, równymi uderzeniami, obracając o kilka stopni po każdym ciosie. Nie zauważył mnie od razu, a ja nie spieszyłam się z tym. Pip przyczłapała na sam skraj ciepłego kręgu, jaki roztaczał wokół siebie ogień, i tam się zatrzymała — rozsądny z niej ptak — po czym usiadła, by z przekrzywioną głową obserwować pomarańczowe światło.</w:t>
+        <w:t xml:space="preserve">Sam Patel stał przy kowadle. W kleszczach trzymał płaską, żelazną gwiazdę, której jedno ramię świeciło pomarańczowym blaskiem w samym środku. Kował ją krótkimi, równymi uderzeniami, obracając o kilka stopni po każdym ciosie. Nie zauważył mnie od razu, a ja go nie poganiałam. Pip przyczłapała na sam skraj ciepłego kręgu, jaki roztaczał wokół siebie ogień, i tam się zatrzymała — rozsądny z niej ptak — po czym usiadła, by z przekrzywioną głową obserwować pomarańczowe światło.</w:t>
       </w:r>
     </w:p>
     <w:p>
@@ -1932,7 +1932,7 @@
     </w:p>
     <w:p>
       <w:r>
-        <w:t>— Robił pan wystrój gospody — odezwałam się swobodnie, obracając świecznik. — Całe to kowalstwo w holu Fiony. Gwiazdy na kominku, kinkiety, osłona przeciwiskrowa.</w:t>
+        <w:t xml:space="preserve">— Robił pan wystrój gospody — odezwałam się swobodnie, obracając świecznik. — Całe to kowalstwo w holu Fiony. Gwiazdy na kominku, kinkiety, ekran kominkowy.</w:t>
       </w:r>
     </w:p>
     <w:p>
@@ -1952,7 +1952,7 @@
     </w:p>
     <w:p>
       <w:r>
-        <w:t>Obserwowałam go, gdy to mówił. Przeżyłam długie życie i nauczyłam się odróżniać ludzi potrafiących okazać emocje od tych, którzy mają tylko jedną twarz. Sam Patel mówił o dwudziestu dolarach jako człowiek o jednej twarzy, z całym swoim bólem wypisanym na powierzchni, tam gdzie dosięgało go światło ognia. Jego gniew był gniewem przyjaciela, w większym stopniu zranionym niż wściekłym, pozbawionym chłodnego wyrachowania szantażysty.</w:t>
+        <w:t xml:space="preserve">Obserwowałam go, gdy to mówił. Przeżyłam długie życie i nauczyłam się odróżniać ludzi, którzy potrafią przybrać dowolne uczucie jak maskę, od tych, którzy mają tylko jedną twarz. Sam Patel mówił o dwudziestu dolarach jako człowiek o jednej twarzy, z całym swoim bólem wypisanym na powierzchni, tam gdzie dosięgało go światło ognia. Jego gniew był gniewem przyjaciela, w większym stopniu zranionym niż wściekłym, pozbawionym chłodnego wyrachowania szantażysty.</w:t>
       </w:r>
     </w:p>
     <w:p>
@@ -1968,7 +1968,7 @@
     </w:p>
     <w:p>
       <w:r>
-        <w:t xml:space="preserve">— Wszyscy mają związane ręce co roku. — W końcu odłożył szmatę i spojrzał mi prosto w oczy. — Nie przeszkadza mi, że wisi mi pieniądze przyjaciel, który ma kłopoty, pani Claus. Całe miasteczko musi sobie radzić, wiem o tym równie dobrze jak ktokolwiek inny, połowę roboty robię na słowo honoru. Gdyby po prostu powiedziała: „Sam, jest ciasno, daj mi czas do wiosny”, wydarłbym rachunek i powiedział, żeby nawet o tym nie myślała. Nie mogę znieść tego, że nie patrzy mi w oczy. Kobieta, której po prostu brakuje gotówki, tak się nie zachowuje. Wstydzi się albo czegoś boi, a nie ma to nic wspólnego z moimi dwudziestoma dolarami i nie mogę podejść dość blisko, żeby pomóc. — Rozłożył poczerniałe od sadzy dłonie. — Czy ona ma kłopoty? Prawdziwe kłopoty? Bo jeśli tak, wolałbym o tym wiedzieć i pomóc, niż stać tutaj i wkurzać się o drobne jak jakiś mały człowieczek.</w:t>
+        <w:t xml:space="preserve">— Wszyscy mają związane ręce co roku. — W końcu odłożył szmatę i spojrzał mi prosto w oczy. — Nie przeszkadza mi, że wisi mi pieniądze przyjaciel, który ma kłopoty, pani Claus. Całe miasteczko musi sobie radzić, wiem o tym równie dobrze jak ktokolwiek inny, połowę roboty robię na słowo honoru. Gdyby po prostu powiedziała: „Sam, jest ciasno, daj mi czas do wiosny”, podarłbym rachunek i powiedział, żeby nawet o tym nie myślała. Nie mogę znieść tego, że nie patrzy mi w oczy. Kobieta, której po prostu brakuje gotówki, tak się nie zachowuje. Wstydzi się albo czegoś boi, a nie ma to nic wspólnego z moimi dwudziestoma dolarami i nie mogę podejść dość blisko, żeby pomóc. — Rozłożył poczerniałe od sadzy dłonie. — Czy ona ma kłopoty? Prawdziwe kłopoty? Bo jeśli tak, wolałbym o tym wiedzieć i pomóc, niż stać tutaj i wkurzać się o drobne jak jakiś mały człowieczek.</w:t>
       </w:r>
     </w:p>
     <w:p>
@@ -1978,12 +1978,12 @@
     </w:p>
     <w:p>
       <w:r>
-        <w:t xml:space="preserve">— Te jej dawne kłopoty, jeśli to kłopoty — rzuciłam najlżej, jak potrafiłam. — Czy wie pan coś o początkach tej gospody? O tym, jak rodzina Fiony weszła w jego posiadanie, dawno temu? Jakieś stare opowieści przekazywane z pokolenia na pokolenie?</w:t>
-      </w:r>
-    </w:p>
-    <w:p>
-      <w:r>
-        <w:t>Spojrzał na mnie bezmyślnie. — Weszła w posiadanie? Zawsze do nich należał. Odkąd się pamięta. Jej prababcia go założyła, to wszystko, co wiem, w holu wisi zdjęcie tej kobiety. — Wzruszył ramionami, wyraźnie zbity z pantałyku tym pytaniem. — Dlaczego miałbym wiedzieć coś więcej? Jestem kowalem. Znam żelazo i wiem, że moi klienci płacą z opóźnieniem. Te stare rodziny i cała ta reszta to dział Theo, Towarzystwo Historyczne. Od kurzu kicham. Nigdy tam nie byłem.</w:t>
+        <w:t xml:space="preserve">— Te jej dawne kłopoty, jeśli to kłopoty — rzuciłam najlżej, jak potrafiłam. — Czy wie pan coś o początkach tej gospody? O tym, jak rodzina Fiony weszła w jej posiadanie, dawno temu? Jakieś stare opowieści przekazywane z pokolenia na pokolenie?</w:t>
+      </w:r>
+    </w:p>
+    <w:p>
+      <w:r>
+        <w:t xml:space="preserve">Spojrzał na mnie bez zrozumienia. — Weszła w posiadanie? Zawsze do nich należała. Odkąd się pamięta. Jej prababcia ją założyła, to wszystko, co wiem, w holu wisi zdjęcie tej kobiety. — Wzruszył ramionami, wyraźnie zbity z pantałyku tym pytaniem. — Dlaczego miałbym wiedzieć coś więcej? Jestem kowalem. Znam żelazo i wiem, że moi klienci płacą z opóźnieniem. Te stare rodziny i cała ta reszta to dział Theo, Towarzystwo Historyczne. Od kurzu kicham. Nigdy tam nie byłem.</w:t>
       </w:r>
     </w:p>
     <w:p>
@@ -2086,7 +2086,7 @@
     <w:p/>
     <w:p>
       <w:r>
-        <w:t xml:space="preserve">— Jeszcze nie koniec. Ale blisko. — Puknął palcem w brzeg pudła. — Wiem, że opuściła dom Blackburnów zimą dwudziestego czwartego roku. Wiem, że nie wyszła żadnymi oficjalnymi drzwiami. Nie odnotowano sprzedaży, darowizny, zapisu w testamencie, niczego na piśmie, co w moim doświadczeniu oznacza, że wyszła nie tymi drzwiami, co trzeba. Kradzież, na sto procent, choć minął już wiek i nic się z tym nie da zrobić. — Odchylił się do tyłu. — Kiedy opuszcza dom, trop na chwilę urywa się, po czym znowu odżywa, choć robi się nikły, o dwa miasteczka stąd. Lombard w Ridgeline. Prowadzili okropne rejestry, te stare lombardy, ale jednak coś tam zapisali; zachował się dziennik dyżurów tamtejszego subiekta i próbuję dopasować widniejącą w nim datę do zimy, kiedy brosza zniknęła. Wtedy będę miał całą historię w pigułce, od rezydencji po lombard, będę mógł postawić kropkę, zamknąć teczkę i jechać do domu.</w:t>
+        <w:t xml:space="preserve">— Jeszcze nie koniec. Ale blisko. — Puknął palcem w brzeg pudła. — Wiem, że opuściła dom Blackburnów zimą dwudziestego czwartego roku. Wiem, że nie wyszła żadnymi oficjalnymi drzwiami. Nie odnotowano sprzedaży, darowizny, zapisu w testamencie, niczego na piśmie, co w moim doświadczeniu oznacza, że wyszła nie tymi drzwiami, co trzeba. Kradzież, niemal na pewno, choć minął już wiek i nic się z tym nie da zrobić. — Odchylił się do tyłu. — Kiedy opuszcza dom, trop na chwilę urywa się, po czym znowu odżywa, choć robi się nikły, o dwa miasteczka stąd. Lombard w Ridgeline. Prowadzili okropne rejestry, te stare lombardy, ale jednak coś tam zapisali; zachował się dziennik dyżurów tamtejszego subiekta i próbuję dopasować widniejącą w nim datę do zimy, kiedy brosza zniknęła. Wtedy będę miał całą historię w pigułce, od rezydencji po lombard, będę mógł postawić kropkę, zamknąć teczkę i jechać do domu.</w:t>
       </w:r>
     </w:p>
     <w:p/>
@@ -2247,7 +2247,7 @@
     </w:p>
     <w:p>
       <w:r>
-        <w:t>Nucenie ustało. Drzwi otworzyły się na szerokość dłoni i w szczelinie ukazała się twarz Nicka — rozemocjonowana, zadowolona, pachnąca świeżo ściętą sosną i tą drugą, cieplejszą wonią, której nie potrafiłam nazwać. Światło w środku było jasne, lecz ja wpatrywałam się wyłącznie w jego twarz i nie zaglądałam do wnętrza, ponieważ dałam słowo.</w:t>
+        <w:t xml:space="preserve">Nucenie ustało. Drzwi otworzyły się na szerokość dłoni i w szczelinie ukazała się twarz Nicka — zarumieniona, zadowolona, pachnąca świeżo ściętą sosną i tą drugą, cieplejszą wonią, której nie potrafiłam nazwać. Światło w środku było jasne, lecz ja wpatrywałam się wyłącznie w jego twarz i nie zaglądałam do wnętrza, ponieważ dałam słowo.</w:t>
       </w:r>
     </w:p>
     <w:p>
@@ -2277,7 +2277,7 @@
     </w:p>
     <w:p>
       <w:r>
-        <w:t>— I warsztat. — Nie zamieniłam tego w pytanie. — Twoja niespodzianka. To część tego planu.</w:t>
+        <w:t xml:space="preserve">— I warsztat. — Nie zamieniłam tego w pytanie. — Twoja niespodzianka. To ma z tym związek.</w:t>
       </w:r>
     </w:p>
     <w:p>
@@ -2323,7 +2323,7 @@
     <w:p/>
     <w:p>
       <w:r>
-        <w:t xml:space="preserve">Ratusz był staromodnym, zbytnio ozdobnym budynkiem z czerwonej cegły na skraju skweru, z wieżą zegarową, która spieszyła się o cztery minuty tak długo, jak wszyscy pamiętali. Poszłam tam w poniedziałek z Pip, mając dwie sprawy do załatwienia — jedną prawdziwą, a drugą mniej. Prawdziwą sprawą było dopisanie nazwy kręgu do listy festiwalowych pomocników oraz zapytanie, w imieniu miasteczka, a nie nikogo konkretnego, czy Frost Falls mogłoby wysupłać trochę pieniędzy dla Towarzystwa Historycznego, zanim jego dach zawali się na dobre. Mniej prawdziwą sprawą było przyjrzeć się dokładnie i z bliska Verze Reed.</w:t>
+        <w:t xml:space="preserve">Ratusz był staromodnym, zbytnio ozdobnym budynkiem z czerwonej cegły na skraju skweru, z wieżą zegarową, która spieszyła się o cztery minuty tak długo, jak wszyscy pamiętali. Poszłam tam w poniedziałek z Pip, mając dwie sprawy do załatwienia — jedną prawdziwą, a drugą mniej. Prawdziwą sprawą było dopisanie nazwy kręgu do listy festiwalowych pomocników oraz zapytanie, w imieniu samego miasteczka, a nie kogokolwiek innego, czy Frost Falls mogłoby wysupłać trochę pieniędzy dla Towarzystwa Historycznego, zanim jego dach zawali się na dobre. Mniej prawdziwą sprawą było przyjrzeć się dokładnie i z bliska Verze Reed.</w:t>
       </w:r>
     </w:p>
     <w:p/>
@@ -2335,7 +2335,7 @@
     <w:p/>
     <w:p>
       <w:r>
-        <w:t>Vera siedziała przy biurku stojącym na zewnątrz jego gabinetu i to ona sprawiała, że całe to miejsce w ogóle funkcjonowało. Wszyscy o tym wiedzieli, ale nikt tego głośno nie mówił. Ona miała pliki dokumentów i klucze. Burmistrz miał nos i uścisk dłoni. Uniosła wzrok, kiedy weszłam, a uśmiech, który zdołała z siebie wykrzesać, był poprawny i mocno zużyty.</w:t>
+        <w:t xml:space="preserve">Vera siedziała przy biurku stojącym na zewnątrz jego gabinetu i to ona sprawiała, że całe to miejsce w ogóle funkcjonowało. Wszyscy o tym wiedzieli, ale nikt tego głośno nie mówił. Ona miała akta i klucze. Burmistrz miał nos i uścisk dłoni. Uniosła wzrok, kiedy weszłam, a uśmiech, który zdołała z siebie wykrzesać, był poprawny i mocno zużyty.</w:t>
       </w:r>
     </w:p>
     <w:p/>
@@ -2353,7 +2353,7 @@
     <w:p/>
     <w:p>
       <w:r>
-        <w:t>Miał minutę i ofiarował mi ją zza swojego czystego biurka, nawet nie siląc się na wstanie. Przedstawiłam sprawę Towarzystwa najlepiej, jak potrafiłam. Dach przepuszczający wodę do tylnych pomieszczeń. Kocioł grzewczy, dla którego była to ostatnia zima. Dwa wieki pamięci miasteczka powoli popadające w ruinę z braku ułamka kwoty, jaką miasteczko gotowe było wydać na jeden weekend festiwalowy. Zrobiłam to ciepło i krótko. Claire powiedziała mi, że smutne opowieści nie uwalniają pieniędzy, i starałam się o coś trwalszego i trudniejszego do zbycia machnięciem ręki niż smutek.</w:t>
+        <w:t xml:space="preserve">Miał minutę i ofiarował mi ją zza swojego czystego biurka, nawet nie siląc się na wstanie. Przedstawiłam sprawę Towarzystwa najlepiej, jak potrafiłam. Dach przepuszczający wodę do tylnych pomieszczeń. Piec, dla którego była to ostatnia zima. Dwa wieki pamięci miasteczka powoli popadające w ruinę z braku ułamka kwoty, jaką miasteczko gotowe było wydać na jeden weekend festiwalowy. Zrobiłam to ciepło i krótko. Claire powiedziała mi, że smutne opowieści nie uwalniają pieniędzy, i starałam się o coś trwalszego i trudniejszego do zbycia machnięciem ręki niż smutek.</w:t>
       </w:r>
     </w:p>
     <w:p/>
@@ -2488,7 +2488,7 @@
     <w:p/>
     <w:p>
       <w:r>
-        <w:t>Kobieta przygnieciona problemami finansowymi. Kobieta trzymająca klucze do stu lat wiedzy o tym, kto był właścicielem czego, z aktami własności Winter Wonderland Inn gdzieś w tych samych szufladach oraz wszystkim tym, co miasteczko zapisało w 1924 roku, kiedy z wielkiej rezydencji zginęła brosza — o ile cokolwiek w ogóle zostało zapisane. Kobieta, która spięła się na słowa rejestry nieruchomości i stała się podejrzanie gadatliwa w tej samej sekundzie, gdy wypowiedziałam nazwisko Blackburn, po czym oznajmiła mi, mając te rejestry za plecami, że nigdy ich nie czyta.</w:t>
+        <w:t xml:space="preserve">Kobieta przygnieciona problemami finansowymi. Kobieta trzymająca klucze do stu lat wiedzy o tym, kto był właścicielem czego, z aktem własności Winter Wonderland Inn gdzieś w tych samych szufladach oraz wszystkim tym, co miasteczko zapisało w 1924 roku, kiedy z wielkiej rezydencji zginęła brosza — o ile cokolwiek w ogóle zostało zapisane. Kobieta, która spięła się na słowa rejestry nieruchomości i stała się podejrzanie gadatliwa w tej samej sekundzie, gdy wypowiedziałam nazwisko Blackburn, po czym oznajmiła mi, mając te rejestry za plecami, że nigdy ich nie czyta.</w:t>
       </w:r>
     </w:p>
     <w:p/>
@@ -2511,7 +2511,7 @@
     <w:p/>
     <w:p>
       <w:r>
-        <w:t xml:space="preserve">Zarząd Towarzystwa Historycznego zebrał się w ten poniedziałkowy wieczór w chłodnym zapleczu pod walącym się dachem. Claire poprosiła, abym poszła z nią, po części dlatego, że „Gazette” chciało widzieć przyjazną twarz w tym gronie, a po części, jak podejrzewałam, domyślała się znacznie więcej, niż mówiła, na temat tego, co dźwigałam, i chciała, żebym na własne oczy zobaczyła, jak źle się dzieje.</w:t>
+        <w:t xml:space="preserve">Zarząd Towarzystwa Historycznego zebrał się w ten poniedziałkowy wieczór w chłodnym zapleczu pod walącym się dachem. Claire poprosiła, abym poszła z nią, po części dlatego, że Gazette chciała widzieć przyjazną twarz w tym gronie, a po części, jak podejrzewałam, domyślała się znacznie więcej, niż mówiła, na temat tego, co dźwigałam, i chciała, żebym na własne oczy zobaczyła, jak źle się dzieje.</w:t>
       </w:r>
     </w:p>
     <w:p>
@@ -2720,7 +2720,7 @@
     <w:p/>
     <w:p>
       <w:r>
-        <w:t xml:space="preserve">Greta trzymała wielką szklaną kulę śnieżną na ladzie w Holly Jolly Bakery, taką pamiątkę dla turystów z małym ceramicznym Frost Falls w środku, ze skwerem, ratuszem i całą resztą.</w:t>
+        <w:t xml:space="preserve">Greta trzymała wielką szklaną kulę śnieżną na ladzie w Holly Jolly Bakery, taką pamiątkę dla turystów z małym ceramicznym Frost Falls w środku, ze skwerem, Ratuszem i całą resztą.</w:t>
       </w:r>
       <w:r>
         <w:t xml:space="preserve"/>
@@ -2762,7 +2762,7 @@
     <w:p/>
     <w:p>
       <w:r>
-        <w:t xml:space="preserve">Na skwerze problem sprawiał Bram. Prancer oswobodziła się w nocy z wybiegu i przyszła do miasteczka, i stała po kostki w opadłych liściach w niecce fontanny, którą miasteczko wyłączało co roku w październiku. Stała tam z uniesioną głową i ani drgnęła.</w:t>
+        <w:t xml:space="preserve">Na skwerze kłopot miał Bram. Prancer oswobodziła się w nocy z wybiegu i przyszła do miasteczka, i stała po kostki w opadłych liściach w niecce fontanny, którą miasteczko wyłączało co roku w październiku. Stała tam z uniesioną głową i ani drgnęła.</w:t>
       </w:r>
     </w:p>
     <w:p/>
@@ -2774,7 +2774,7 @@
     <w:p/>
     <w:p>
       <w:r>
-        <w:t>— Pani Claus! — Nawet się nie odwrócił. — Tym razem to Prancer! Prancer! Siedzi w fontannie, a przecież nawet nie ma w niej wody, i nie chce wyjść, a wokół zbiera się tłum, i próbowałem wszystkiego, próbowałem cukru, próbowałem surowości, próbowałem przemawiać jej do rozumu, co, przyznaję, było optymistyczne. — Pociągnął mocniej, a Prancer spojrzała na niego ze spokojną obojętnością stworzenia, które nie miało zamiaru nigdzie się ruszać. — Dwie uciekły. Dwie! Prancer w fontannie, a Vixen jakoś wlazła do sali parafialnej i zjadła słomę ze stajenki betlejemskiej, i wcale a wcale jej nie jest żal, widać, że wcale jej nie jest żal, niech pani spojrzy, och, jej tu nie ma, ona jest przy kościele, ale gdyby tu była, widziałaby pani, że nie żałuje ani trochę.</w:t>
+        <w:t xml:space="preserve">— Pani Claus! — Nawet się nie odwrócił. — Tym razem to Prancer! Prancer! Stoi w fontannie, a przecież nawet nie ma w niej wody, i nie chce wyjść, a wokół zbiera się tłum, i próbowałem wszystkiego, próbowałem cukru, próbowałem surowości, próbowałem przemawiać jej do rozumu, co, przyznaję, było optymistyczne. — Pociągnął mocniej, a Prancer spojrzała na niego ze spokojną obojętnością stworzenia, które nie miało zamiaru nigdzie się ruszać. — Dwie uciekły. Dwie! Prancer w fontannie, a Vixen jakoś wlazła do sali parafialnej i zjadła słomę ze stajenki betlejemskiej, i wcale a wcale jej nie jest żal, widać, że wcale jej nie jest żal, niech pani spojrzy, och, jej tu nie ma, ona jest przy kościele, ale gdyby tu była, widziałaby pani, że nie żałuje ani trochę.</w:t>
       </w:r>
     </w:p>
     <w:p/>
@@ -2877,7 +2877,7 @@
     </w:p>
     <w:p>
       <w:r>
-        <w:t xml:space="preserve">Ivy opowiadała historię z fontanną. Słyszała ją od pana Kima, który przyglądał się całemu zajściu ze swojego składanego krzesełka. W wersji Ivy Prancer siedziała w fontannie od świtu, a Bram wszedł za nią po pachy.</w:t>
+        <w:t xml:space="preserve">Ivy opowiadała historię z fontanną. Słyszała ją od pana Kima, który przyglądał się całemu zajściu ze swojego składanego krzesełka. W wersji Ivy Prancer stała w fontannie od świtu, a Bram wszedł za nią po pachy.</w:t>
       </w:r>
     </w:p>
     <w:p>
@@ -2972,7 +2972,7 @@
     </w:p>
     <w:p>
       <w:r>
-        <w:t>Głowa Claire poszła w górę.</w:t>
+        <w:t xml:space="preserve">Claire podniosła głowę.</w:t>
       </w:r>
     </w:p>
     <w:p>
@@ -3022,7 +3022,7 @@
     </w:p>
     <w:p>
       <w:r>
-        <w:t xml:space="preserve">Pip dała spokój słoikowi z guzikami. Podeszła i położyła się u stóp Marthy, tuż obok ciepłego boku pieca. Martha wysunęła jedną stopę z buta i oparła ją na grzbiecie Pip.</w:t>
+        <w:t xml:space="preserve">Pip dała spokój słoikowi z guzikami. Podeszła i położyła się u stóp Marthy, tuż obok ciepłego boku kozy. Martha wysunęła jedną stopę z buta i oparła ją na grzbiecie Pip.</w:t>
       </w:r>
     </w:p>
     <w:p>
@@ -3052,7 +3052,7 @@
     </w:p>
     <w:p>
       <w:r>
-        <w:t xml:space="preserve">Wypisałam imiona po lewej stronie kartki. Sam. Neil. Jamal. Vera. Theo. A u góry zapisałam tylko dwa pytania, które miały jakiekolwiek znaczenie, dwa pytania, na które szantażysta musiałby odpowiedzieć twierdząco — na oba, inaczej to nie był on. </w:t>
+        <w:t xml:space="preserve">Wypisałam imiona po lewej stronie kartki. Sam. Neil. Jamal. Vera. Theo. A u góry zapisałam tylko dwa pytania, które miały jakiekolwiek znaczenie, dwa pytania, na które szantażysta musiałby odpowiedzieć twierdząco — na oba, inaczej to nie mogła być ta osoba. </w:t>
       </w:r>
       <w:r>
         <w:rPr>
@@ -3143,12 +3143,12 @@
     </w:p>
     <w:p>
       <w:r>
-        <w:t xml:space="preserve">— Nie chcę, żeby to był ktokolwiek. — Przycisnąłam obie dłonie płasko do stołu po obu stronach kartki. — Chcę, żeby cała ta historia okazała się pomyłką. Chcę, żeby Neil okazał się sprytnym szelmą, żeby to był jakiś obcy, którego przywiało do miasteczka, a nie przyjaciel, który mieszka tu od trzydziestu lat. Ale pragnienia to nie dowody, Nick, nigdy nie były, a każdy fakt, do którego docieram, układa się w ten sam kształt, a w środku tego kształtu widnieje imię Theo. Listy wyszły z archiwum. Notatka jest napisana na papierze z archiwum. A człowiek, który tym archiwum zarządza, jest zdesperowany. Stukał do każdych uczciwych drzwi i wszędzie odbijał się od ściany. — Potrząsnęłam głową. — To okropny kształt. Cały czas mam nadzieję, że kolejny fakt go rozbije. A tymczasem kolejny fakt tylko dokłada do niego kolejny kamień.</w:t>
-      </w:r>
-    </w:p>
-    <w:p>
-      <w:r>
-        <w:t xml:space="preserve">— W takim razie to przetestuj — odparł Nick — zamiast siedzieć tu w kuchni i drżeć przed tym, co w niczym nie pomogło i nigdy nie pomoże. Idź i spójrz na tę jedną rzecz, na którą jeszcze porządnie nie spojrzałaś. Na same listy albo na miejsce, w którym powinny się znajdować. — Wyciągnął rękę przez stół i położył swoją ciepłą dłoń płasko na mojej zmarzniętej. — Theo przydałaby się para rąk do porządkowania tego archiwum. Idź i mu je zaoferuj. A pomagając, dowiedz się jednej jedynej rzeczy. Czy słowa w tym liściku pasują do słów w listach, które zaginęły. Ponieważ jeśli tak, Jess, to ten, kto napisał tę notatkę, nie tylko czytał papiery Blackburnów ogólnie. On trzymał w rękach dokładnie tamte listy. A w Frost Falls jest bardzo krótka lista ludzi, którzy mogliby to powiedzieć.</w:t>
+        <w:t xml:space="preserve">— Nie chcę, żeby to był ktokolwiek. — Przycisnąłam obie dłonie płasko do stołu po obu stronach kartki. — Chcę, żeby cała ta historia okazała się pomyłką. Chcę, żeby Neil okazał się sprytnym złoczyńcą, żeby to był jakiś obcy, którego przywiało do miasteczka, a nie przyjaciel, który mieszka tu od trzydziestu lat. Ale pragnienia to nie dowody, Nick, nigdy nie były, a każdy fakt, do którego docieram, układa się w ten sam kształt, a w środku tego kształtu widnieje imię Theo. Listy wyszły z archiwum. Notatka jest napisana na papierze z archiwum. A człowiek, który tym archiwum zarządza, jest zdesperowany. Stukał do każdych uczciwych drzwi i wszędzie odbijał się od ściany. — Potrząsnęłam głową. — To okropny kształt. Cały czas mam nadzieję, że kolejny fakt go rozbije. A tymczasem kolejny fakt tylko dokłada do niego kolejny kamień.</w:t>
+      </w:r>
+    </w:p>
+    <w:p>
+      <w:r>
+        <w:t xml:space="preserve">— W takim razie to przetestuj — odparł Nick — zamiast siedzieć tu w kuchni i drżeć przed tym, co w niczym nie pomogło i nigdy nie pomoże. Idź i spójrz na tę jedną rzecz, na którą jeszcze porządnie nie spojrzałaś. Na same listy albo na miejsce, w którym powinny się znajdować. — Wyciągnął rękę przez stół i położył swoją ciepłą dłoń płasko na mojej zmarzniętej. — Theo przydałaby się para rąk do porządkowania tego archiwum. Idź i mu je zaoferuj. A pomagając, dowiedz się jednej jedynej rzeczy. Czy słowa w tym liściku pasują do słów w listach, które zaginęły. Ponieważ jeśli tak, Jess, to osoba, która napisała tę notatkę, nie tylko czytała papiery Blackburnów ogólnie. Dokładnie tamte listy musiały być w jej rękach. A w Frost Falls jest bardzo krótka lista ludzi, którzy mogliby to powiedzieć.</w:t>
       </w:r>
     </w:p>
     <w:p>
@@ -3251,7 +3251,7 @@
     <w:p/>
     <w:p>
       <w:r>
-        <w:t xml:space="preserve">— Niech pan ma oko na recepcję — powiedziałam mu, skoro sam o to pytał i zasłużył na prawdziwą odpowiedź. — W ten weekend jest festiwal i gospodą będą przewijać się tłumy obcych ludzi przez cały dzień. Jeśli ktoś położy coś na tym biurku i szybko się oddali w tym całym zgiełku, niech pan zapamięta dla mnie jego twarz. Ma pan bystre oczy, a i tak będzie pan tutaj na drabinie. Tylko tyle chcę. Proszę ich nie zatrzymywać, nie mówić ani słowa, nie dać nic po sobie poznać. Po prostu zapamiętać twarz.</w:t>
+        <w:t xml:space="preserve">— Niech pan ma oko na recepcję — powiedziałam mu, skoro sam o to pytał i zasłużył na prawdziwą odpowiedź. — W ten weekend jest festiwal i gospodą będą przewijać się tłumy obcych ludzi przez cały dzień. Jeśli ktoś położy coś na tym biurku i szybko się oddali w tym całym zgiełku, niech pan zapamięta dla mnie twarz tej osoby. Ma pan bystre oczy, a i tak będzie pan tutaj na drabinie. Tylko tyle chcę. Proszę ich nie zatrzymywać, nie mówić ani słowa, nie dać nic po sobie poznać. Po prostu zapamiętać twarz.</w:t>
       </w:r>
     </w:p>
     <w:p/>
@@ -3329,7 +3329,7 @@
     </w:p>
     <w:p>
       <w:r>
-        <w:t>To była, jak pomyślałam, najbardziej pożyteczna rzecz, jaką ktokolwiek mi powiedział w całej tej sprawie, a on oddał ją za darmo, z każdym słowem oczyszczając się jeszcze bardziej. Szantażista handluje rozmiarem groźby. Neil właśnie mi powiedział, niepytany, że ta groźba była pusta, że brosza nie mogła skrzywdzić Fiony w żadnym sądzie na świecie, że jedyną ostrą krawędzią, jaka w niej została, był jej lęk przed spojrzeniami miasteczka. Człowiek prowadzący wymuszenie obciąłby sobie język, zanim by mi to powiedział. Pozwoliłby temu strachowi trwać, ponieważ strach był całym jego towarem.</w:t>
+        <w:t xml:space="preserve">To była, jak pomyślałam, najbardziej pożyteczna rzecz, jaką ktokolwiek mi powiedział w całej tej sprawie, a on oddał ją za darmo, z każdym słowem oczyszczając się jeszcze bardziej. Szantażysta handluje rozmiarem groźby. Neil właśnie mi powiedział, niepytany, że ta groźba była pusta, że brosza nie mogła skrzywdzić Fiony w żadnym sądzie na świecie, że jedyną ostrą krawędzią, jaka w niej została, był jej lęk przed spojrzeniami miasteczka. Człowiek prowadzący wymuszenie obciąłby sobie język, zanim by mi to powiedział. Pozwoliłby temu strachowi trwać, ponieważ strach był całym jego towarem.</w:t>
       </w:r>
     </w:p>
     <w:p>
@@ -3349,7 +3349,7 @@
     </w:p>
     <w:p>
       <w:r>
-        <w:t xml:space="preserve">— Należało jej się — rzekł Neil, patrząc, jak czytam. — To ta część, którą plotki zawsze pomijają, bo plotka chce czystego, małego złoczyńcy i czystej, małej zbrodni. Blackburnowie nie płacili swoim domownikom od miesięcy, tamtej zimy dwudziestego czwartego. Mam tam te skargi, innych służących, którzy odeszli, i list, pani Claus, list od samej Constance, która bardzo uprzejmie prosi o zaległą pensję, a w odpowiedzi słyszy, że powinna być wdzięczna, iż ma dach nad głową. Jej matka umierała tej samej zimy, trzy ulice dalej, a nie było pieniędzy na lekarza, ani centa. I ona tam była, dzień po dniu, wycierając kurze z broszy wartej więcej, niż zarobiłaby przez trzy życia, podczas gdy rodzina, do której należała, kazała jej być wdzięczna. — Rozłożył ręce. — Nie twierdzę, że miała rację, biorąc ją. Twierdzę, że nie była złodziejką w ten prosty sposób, w jaki liścik każe wierzyć pani przyjaciółce. Była zdesperowaną dziewczyną, obrabowaną najpierw przez bogatych ludzi, których było stać na zapłatę, a którzy postanowili tego nie robić. Spłaciła się sama tą jedyną rzeczą, do której miała dostęp, i zbudowała na tym sto lat uczciwego powitania. Są gorsze fundamenty dla gospody.</w:t>
+        <w:t xml:space="preserve">— Należało jej się — rzekł Neil, patrząc, jak czytam. — To ta część, którą plotki zawsze pomijają, bo plotka chce czystego, małego złoczyńcy i czystej, małej zbrodni. Blackburnowie nie płacili swoim domownikom od miesięcy, tamtej zimy dwudziestego czwartego. Mam tam te skargi, innych służących, którzy odeszli, i list, pani Claus, list od samej Constance, która bardzo uprzejmie prosi o zaległą pensję, a w odpowiedzi słyszy, że powinna być wdzięczna, iż ma dach nad głową. Jej matka umierała tej samej zimy, trzy ulice dalej, a nie było pieniędzy na lekarza, ani centa. I ona tam była, dzień po dniu, wycierając kurze z broszy wartej więcej, niż zarobiłaby przez trzy życia, podczas gdy rodzina, do której ta brosza należała, kazała jej być wdzięczna. — Rozłożył ręce. — Nie twierdzę, że miała rację, biorąc ją. Twierdzę, że nie była złodziejką w ten prosty sposób, w jaki liścik każe wierzyć pani przyjaciółce. Była zdesperowaną dziewczyną, obrabowaną najpierw przez bogatych ludzi, których było stać na zapłatę, a którzy postanowili tego nie robić. Spłaciła się sama tą jedyną rzeczą, do której miała dostęp, i zbudowała na tym sto lat uczciwego powitania. Są gorsze fundamenty dla gospody.</w:t>
       </w:r>
     </w:p>
     <w:p>
@@ -3391,7 +3391,7 @@
     <w:p/>
     <w:p>
       <w:r>
-        <w:t xml:space="preserve">Archiwum znajdowało się w długim pomieszczeniu na zapleczu sali wystawowej, szczelnie zastawionym od podłogi po sufit pudłami archiwizacyjnymi, i stanowiło, jak Theo sam przyznał przed całym miasteczkiem podczas otwarcia, chwalebną katastrofę. Przywitał mnie tam poszarzały i wdzięczny, w tym samym przekrzywionym krawacie, po czym posadził przy stole roboczym do sortowania pliku dokumentów domowych, podczas gdy on sam pracował po drugiej stronie sali. Przez większą część godziny pracowaliśmy w miłej ciszy dwóch osób, które kochają porządek i oboje, na swój sposób, odnajdują ukojenie w jego zaprowadzaniu. Pip zajęła posterunek na niskim stosie pudeł tuż obok mnie i bacznie obserwowała mosiężne spinacze w moim podajniku. Przez tę godzinę pozwoliłam sobie niemal zapomnieć, po co tam przyszłam.</w:t>
+        <w:t xml:space="preserve">Archiwum znajdowało się w długim pomieszczeniu na zapleczu sali wystawowej, szczelnie zastawionym od podłogi po sufit pudłami archiwizacyjnymi, i stanowiło, jak Theo sam przyznał przed całym miasteczkiem podczas otwarcia, chwalebną katastrofę. Przywitał mnie tam poszarzały i wdzięczny, w tym samym przekrzywionym krawacie, po czym posadził przy stole roboczym do sortowania pliku dokumentów domowych, podczas gdy on sam pracował po drugiej stronie sali. Przez większą część godziny pracowaliśmy w miłej ciszy dwóch osób, które kochają porządek i oboje, na swój sposób, odnajdują ukojenie w jego zaprowadzaniu. Pip zajęła posterunek na niskim stosie pudeł tuż obok mnie i bacznie obserwowała mosiężne spinacze na mojej tacce. Przez tę godzinę pozwoliłam sobie niemal zapomnieć, po co tam przyszłam.</w:t>
       </w:r>
     </w:p>
     <w:p/>
@@ -3418,7 +3418,7 @@
     <w:p/>
     <w:p>
       <w:r>
-        <w:t>Powinnam je odłożyć bez czytania. Podniosłam je.</w:t>
+        <w:t xml:space="preserve">Powinnam była je odłożyć bez czytania. Podniosłam je.</w:t>
       </w:r>
     </w:p>
     <w:p/>
@@ -3430,7 +3430,7 @@
         <w:rPr>
           <w:i/>
         </w:rPr>
-        <w:t xml:space="preserve">Korespondencja Adelaide Blackburn do siostry, zima 1924 r. Dotyczy kradzieży rodzinnej broszy (szafir w jej sercu) przez domową służbę; klejnot zastawiono później w Ridgeline. O dużym znaczeniu lokalnym.</w:t>
+        <w:t xml:space="preserve">Korespondencja Adelaide Blackburn do siostry, zima 1924 r. Dotyczy kradzieży rodzinnej broszy (szafir w jej sercu) przez kogoś ze służby domowej; klejnot zastawiono później w Ridgeline. O dużym znaczeniu lokalnym.</w:t>
       </w:r>
     </w:p>
     <w:p/>
@@ -3472,7 +3472,7 @@
     <w:p/>
     <w:p>
       <w:r>
-        <w:t>Nie skonfrontowałam się z nim. To nie był moment. Rzecz zrobiona w gorączce to rzecz zrobiona źle, a wciąż otwarta pozostawała kwestia jak, dokładnie, i czy działał sam. Dokończyłam więc tę godzinę. Powiedziałam Theo, że sortowanie idzie wspaniale, co było prawdą. Pozwoliłam mu uścisnąć moje dłonie w drzwiach, podziękować mi i wyznać ze lśniącymi zmęczeniem oczami, że wystawa przyniosła czterdziestu nowych członków, czterdziestu, czy ja rozumiem, co to może znaczyć dla Towarzystwa. Odparłam, że to wspaniale, i miałam na myśli cud jego nadziei, nawet gdy łamała mi serce. Potem zeszłam po schodach w zimno, czując, że nogi nie do końca mnie słuchają.</w:t>
+        <w:t xml:space="preserve">Nie skonfrontowałam się z nim. To nie był moment. Rzecz zrobiona w gorączce to rzecz zrobiona źle, a wciąż otwarta pozostawała kwestia jak, dokładnie, i czy działał sam. Dokończyłam więc tę godzinę. Powiedziałam Theo, że sortowanie idzie wspaniale, co było prawdą. Pozwoliłam mu uścisnąć moje dłonie w drzwiach, podziękować mi i wyznać, a jego zmęczone oczy lśniły, że wystawa przyniosła czterdziestu nowych członków, czterdziestu, czy ja rozumiem, co to może znaczyć dla Towarzystwa. Odparłam, że to wspaniale, i miałam na myśli cud jego nadziei, nawet gdy łamała mi serce. Potem zeszłam po schodach w zimno, czując, że nogi nie do końca mnie słuchają.</w:t>
       </w:r>
     </w:p>
     <w:p/>
@@ -3544,7 +3544,7 @@
     <w:p/>
     <w:p>
       <w:r>
-        <w:t xml:space="preserve">W centrum pomieszczenia, tam gdzie niegdyś stało dawne palenisko Bieguna, zbudował wielki kominek z polnych kamieni — rzecznych okrąglaków ułożonych ręcznie jeden na drugim. Nie płonął w nim żaden ogień. Ruszt stał zimny i pusty, a jednak lśnił. Ciepłe złoto sączyło się z samego surowego kamienia. Bezdomna magia, która krążyła od drzwi do drzwi po całym Frost Falls, dotarła wreszcie i tutaj, i zataczała powolne kręgi w ciepłym powietrzu nad pustym paleniskiem niczym zmęczone stworzenie, które w końcu znalazło miejsce, gdzie pewnego dnia być może wolno mu będzie odpocząć.</w:t>
+        <w:t xml:space="preserve">W centrum pomieszczenia, w miejscu, w którym na Biegunie stałoby dawne palenisko, zbudował wielki kominek z polnych kamieni — rzecznych okrąglaków ułożonych ręcznie jeden na drugim. Nie płonął w nim żaden ogień. Ruszt stał zimny i pusty, a jednak lśnił. Ciepłe złoto sączyło się z samego surowego kamienia. Bezdomna magia, która krążyła od drzwi do drzwi po całym Frost Falls, dotarła tutaj, przynajmniej jej część, i zataczała powolne kręgi w ciepłym powietrzu nad pustym paleniskiem niczym zmęczone stworzenie, które w końcu znalazło miejsce, gdzie pewnego dnia być może wolno mu będzie odpocząć.</w:t>
       </w:r>
     </w:p>
     <w:p/>
@@ -3651,7 +3651,7 @@
     <w:p/>
     <w:p>
       <w:r>
-        <w:t>— Niedziela — powiedziała Fiona. — To trzy dni. Nie zdobędę ich w trzy dni, nie zdobędę ich przez trzy lata, a on musiał to wiedzieć, musiał, więc o co mu w ogóle chodzi? Czy on po prostu chce patrzeć, jak tonę?</w:t>
+        <w:t xml:space="preserve">— Niedziela — powiedziała Fiona. — To trzy dni. Nie zdobędę ich w trzy dni, nie zdobędę ich przez trzy lata, a on musi to wiedzieć, musi, więc o co mu w ogóle chodzi? Czy on po prostu chce patrzeć, jak tonę?</w:t>
       </w:r>
     </w:p>
     <w:p/>
@@ -3732,7 +3732,7 @@
     <w:p/>
     <w:p>
       <w:r>
-        <w:t xml:space="preserve">Ktoś jednak potrafił. Ktoś, kto poruszał się po tym miasteczku tak zwyczajnie, że niczyje oko się na nim nie zatrzymało; ktoś, kto mógł wpaść do gospody pośród tłumu festiwalowego, położyć rzecz na stole, pójść dalej i nie zostawić po sobie najmniejszego śladu. Nie potrafiłam dostrzec, kto to mógł być. Trzymając jednak w dłoniach dwa liściki, dostrzegłam po raz pierwszy, że dłoń, która je napisała, oraz dłoń, która przyniosła je do holu, wcale mogły nie być tą samą dłonią.</w:t>
+        <w:t xml:space="preserve">Ktoś jednak potrafił. Ktoś, kto poruszał się po tym miasteczku tak zwyczajnie, że niczyje oko nie miało się na czym zatrzymać; ktoś, kto mógł wpaść do gospody pośród tłumu festiwalowego, położyć rzecz na stole, pójść dalej i nie zostawić po sobie najmniejszego śladu. Nie potrafiłam dostrzec, kto to mógł być. Trzymając jednak w dłoniach dwa liściki, dostrzegłam po raz pierwszy, że dłoń, która je napisała, oraz dłoń, która przyniosła je do holu, wcale mogły nie być tą samą dłonią.</w:t>
       </w:r>
     </w:p>
     <w:p/>
@@ -3770,7 +3770,7 @@
     </w:p>
     <w:p>
       <w:r>
-        <w:t xml:space="preserve">Pip robiła furorę. Wiedziałam, że tak będzie. Fiona urządziła w rogu ganku gospody kącik fotograficzny: krzesło, namalowane zimowe tło i kosz z dzierganymi szalikami. Za dolara wrzuconego na rzecz Towarzystwa Historycznego można było sobie zrobić zdjęcie z prawdziwym pingwinem z Bieguna Północnego. Przez całe popołudnie kolejka wiła się wzdłuż ganku i schodziła w dół po schodkach. Pip miała na sobie inny szalik do każdego zdjęcia i z wiekową godnością przyjmowała wyrazy uwielbienia. Z wielką powagą odmawiała każdego kawałka kruchego ciasteczka, które dzieci próbowały jej podsunąć pod stołem. Banknoty jednodolarowe piętrzyły się w słoiku i były to pierwsze pieniądze, jakie Towarzystwo zebrało od czasu kradzieży kasetki Olivii. To ich nie uratuje. Słoik pełen jednodolarówek nie ocali budynku. Było to jednak coś i było w tym ciepło. Fiona stała obok fotobudki, inkasując dolary i posyłając ludziom prawdziwy uśmiech, przez jedno popołudnie znów przypominając dawną siebie.</w:t>
+        <w:t xml:space="preserve">Pip robiła furorę. Wiedziałam, że tak będzie. Fiona urządziła w rogu ganku gospody kącik fotograficzny: krzesło, namalowane zimowe tło i kosz z dzierganymi szalikami. Za dolara wrzuconego na rzecz Towarzystwa Historycznego można było sobie zrobić zdjęcie z prawdziwym pingwinem z Bieguna Północnego. Przez całe popołudnie kolejka wiła się wzdłuż ganku i schodziła w dół po schodkach. Pip miała na sobie inny szalik do każdego zdjęcia i z wiekową godnością przyjmowała wyrazy uwielbienia. Z wielką powagą odmawiała każdego kawałka kruchego ciasteczka, które dzieci próbowały jej podsunąć pod stołem. Banknoty jednodolarowe piętrzyły się w słoiku i były to pierwsze pieniądze, jakie Towarzystwo zebrało od czasu zbiórki Olivii do blaszanej kasetki. To ich nie uratuje. Słoik pełen jednodolarówek nie ocali budynku. Było to jednak coś i było w tym ciepło. Fiona stała obok fotobudki, inkasując dolary i posyłając ludziom prawdziwy uśmiech, przez jedno popołudnie znów przypominając dawną siebie.</w:t>
       </w:r>
     </w:p>
     <w:p>
@@ -3790,7 +3790,7 @@
     </w:p>
     <w:p>
       <w:r>
-        <w:t>W środku popołudnia na moment pomyślałam, że właśnie do tego doszło. Jakaś postać przemknęła na ganek gospody, zatrzymała się przy otwartych drzwiach, rozejrzała się i sięgnęła w stronę recepcji. Serce mi zamarło. Ruszyłam przez skwer zbyt szybko, a Sam już zrywał się ze swojego stanowiska. Wtedy postać się odwróciła i okazało się, że to tylko pani Pelletier z zarządu Towarzystwa, która przyniosła stos ulotek członkowskich, by goście mogli je zobaczyć na biurku. Sam i ja dotarliśmy na miejsce w tej samej sekundzie, z przeciwnych kierunków, oboje o wiele za szybko, i spotkaliśmy się spojrzeniami ponad ulotkami. Pani Pelletier spojrzała na nas zdezorientowana. Wzięłam trzy ulotki, które nie były mi do niczego potrzebne, Sam wymamrotał coś o pogodzie i wycofaliśmy się. To było najbliższe starcie tego dnia. Fałszywy alarm. Pokazało mi to jednak, jak bardzo byłam spięta pod tą muzyką ze skrzypiec i jak cienka była granica pomiędzy ciepłem a strachem.</w:t>
+        <w:t xml:space="preserve">W środku popołudnia na moment pomyślałam, że właśnie do tego doszło. Jakaś postać przemknęła na ganek gospody, zatrzymała się przy otwartych drzwiach, rozejrzała się i sięgnęła w stronę recepcji. Serce mi zamarło. Ruszyłam przez skwer zbyt szybko, a Sam już zrywał się ze swojego stanowiska. Wtedy postać się odwróciła i okazało się, że to tylko pani Pelletier z zarządu Towarzystwa, która przyniosła stos ulotek członkowskich, by goście mogli je zobaczyć na biurku. Sam i ja dotarliśmy na miejsce w tej samej sekundzie, z przeciwnych kierunków, oboje o wiele za szybko, i spotkaliśmy się spojrzeniami ponad ulotkami. Pani Pelletier spojrzała na nas zdezorientowana. Wzięłam trzy ulotki, które nie były mi do niczego potrzebne, Sam wymamrotał coś o pogodzie i wycofaliśmy się. Do niczego bliższego tego dnia nie doszło. Fałszywy alarm. Pokazało mi to jednak, jak bardzo byłam spięta pod tą muzyką ze skrzypiec i jak cienka była granica pomiędzy ciepłem a strachem.</w:t>
       </w:r>
     </w:p>
     <w:p>
@@ -3810,7 +3810,7 @@
     </w:p>
     <w:p>
       <w:r>
-        <w:t xml:space="preserve">— Aha. — Pociągnęła łyk soku. Nie patrzyła na mnie. Obserwowała tłum, tak jak ja przez całe popołudnie. — Sam Patel zresztą też. To już dwoje z was pilnujących przedniej recepcji Fiony. Czy jest coś, o czym powinnam wiedzieć, pani Claus?</w:t>
+        <w:t xml:space="preserve">— Aha. — Pociągnęła łyk soku. Nie patrzyła na mnie. Obserwowała tłum, tak jak ja przez całe popołudnie. — Sam Patel zresztą też. To już dwoje z was pilnujących recepcji Fiony. Czy jest coś, o czym powinnam wiedzieć, pani Claus?</w:t>
       </w:r>
     </w:p>
     <w:p>
@@ -3840,7 +3840,7 @@
     </w:p>
     <w:p>
       <w:r>
-        <w:t>Stałam w padającym śniegu pośród moich sąsiadów, z Pip opartą o mój but, czując dłoń Emmy w rękawiczce po jednej stronie i dłoń Fiony po drugiej. Patrząc na to wszystko — lampiony, śnieg, złote światło, setki twarzy wpatrzonych w niebo — zrozumiałam całą sobą, trzewiami, zanim jeszcze głowa nadążyła za uczuciami, co tak naprawdę było na szali. Nie budynek. Nawet nie sekret. To właśnie. To zgromadzenie, to miasteczko pokazujące swoją najlepszą twarz w jasny, zimny dzień. Ktoś wyciągnął rękę z ciemności, by zażądać okupu za ten ułamek rzeczywistości, by zmienić go w broń i lęk. Stojąc tak w śniegu, mój umysł stał się twardy i przejrzysty jak mróz. Niezależnie od tego, co mnie to będzie kosztowało, nie pozwolę mu utrzymać nad tym władzy. Wydobędę to na światło dzienne, w taki dzień jak ten, w którym wszystko może się zagoić.</w:t>
+        <w:t xml:space="preserve">Stałam w padającym śniegu pośród moich sąsiadów, z Pip opartą o mój but, czując dłoń Emmy w rękawiczce po jednej stronie i dłoń Fiony po drugiej. Patrząc na to wszystko — lampiony, śnieg, złote światło, setki twarzy wpatrzonych w niebo — zrozumiałam całą sobą, trzewiami, zanim jeszcze głowa nadążyła za uczuciami, co tak naprawdę było na szali. Nie budynek. Nawet nie sekret. To właśnie. To zgromadzenie, to miasteczko pokazujące swoją najlepszą twarz w jasny, zimny dzień. Ktoś wyciągnął rękę z ciemności, by zażądać okupu za ten ułamek rzeczywistości, by zmienić go w broń i lęk. Gdy tak stałam w śniegu, mój umysł stał się twardy i przejrzysty jak mróz. Niezależnie od tego, co mnie to będzie kosztowało, nie pozwolę mu utrzymać nad tym władzy. Wydobędę to na światło dzienne, w taki dzień jak ten, w którym wszystko może się zagoić.</w:t>
       </w:r>
     </w:p>
     <w:p>
@@ -3954,7 +3954,7 @@
     <w:p/>
     <w:p>
       <w:r>
-        <w:t>Siedziałam bez ruchu w świetle lampy. Kradzież broszy i zakup gospody były dwoma osobnymi sekretami, przechowywanymi w dwóch różnych budynkach. Theo miał jeden z nich. Posiadał archiwum, listy, kartę katalogową, papeterię. Miał kradzież. Ale dowód na to, że skradzione pieniądze stały się tą ukochaną gospodą, znajdował się w Ratuszu, w rejestrach nieruchomości, o których sztywna, zmęczona kobieta przysięgała mi prosto w oczy, że nigdy do nich nie zagląda.</w:t>
+        <w:t xml:space="preserve">Siedziałam bez ruchu w świetle lampy. Kradzież broszy i zakup gospody były dwoma osobnymi sekretami, przechowywanymi w dwóch różnych budynkach. Theo miał jeden z nich. Posiadał archiwum, listy, kartę katalogową, papeterię. Miał w ręku tajemnicę kradzieży. Ale dowód na to, że skradzione pieniądze stały się tą ukochaną gospodą, znajdował się w Ratuszu, w rejestrach nieruchomości, o których sztywna, zmęczona kobieta przysięgała mi prosto w oczy, że nigdy do nich nie zagląda.</w:t>
       </w:r>
     </w:p>
     <w:p/>
@@ -3996,7 +3996,7 @@
     <w:p/>
     <w:p>
       <w:r>
-        <w:t>Rano pójdę tam i upewnię się co do drugiej pary.</w:t>
+        <w:t xml:space="preserve">Rano miałam pójść i upewnić się co do drugiej pary.</w:t>
       </w:r>
     </w:p>
     <w:p>
@@ -4084,7 +4084,7 @@
     <w:p/>
     <w:p>
       <w:r>
-        <w:t xml:space="preserve">Theo miał kradzież. Znalazł ją w listach Blackburnów, broszę, kamień, lombard. Spisał to starannym charakterem pisma, szafir w jej sercu, a potem wyciągnął te listy z kartotek i nazwał je zaginionymi. Ale tonący Theo, obserwowany przez całe miasteczko, nigdy niebywający w domu, nie mógł zrobić reszty. Nie mógł potwierdzić, że gospodę kupiono za te pieniądze, ponieważ ten dowód nie znajdował się w jego budynku. I nie mógł zanieść tych liścików przez miasteczko i położyć jednego na zatłoczonym biurku w biały festiwalowy dzień, ponieważ Theo Hussein nie potrafił przejść niezauważony aleją Evergreen, by uratować własne życie.</w:t>
+        <w:t xml:space="preserve">Theo miał w ręku tajemnicę kradzieży. Znalazł ją w listach Blackburnów, broszę, kamień, lombard. Spisał to starannym charakterem pisma, szafir w jej sercu, a potem wyciągnął te listy z kartotek i nazwał je zaginionymi. Ale tonący Theo, obserwowany przez całe miasteczko, nigdy niebywający w domu, nie mógł zrobić reszty. Nie mógł potwierdzić, że gospodę kupiono za te pieniądze, ponieważ ten dowód nie znajdował się w jego budynku. I nie mógł zanieść tych liścików przez miasteczko i położyć jednego na zatłoczonym biurku w biały festiwalowy dzień, ponieważ Theo Hussein nie potrafił przejść niezauważony aleją Evergreen, by uratować własne życie.</w:t>
       </w:r>
     </w:p>
     <w:p/>
@@ -4191,13 +4191,13 @@
     <w:p/>
     <w:p>
       <w:r>
-        <w:t xml:space="preserve">— Nie mogę tego zakopać — powiedziałam. — Chcę tego. Bóg mi świadkiem, że chcę pójść tam dzisiaj wieczorem, wyszeptać to wszystko i pozwolić każdemu zachować swoje życie. Ale jeśli tak zrobię, Fiona nigdy nie przestanie się bać, tak naprawdę. Theo nigdy nie będzie musiał stać się człowiekiem, któremu można przebaczyć. A zgnilizna zostaje w murach tam, gdzie jej nie widzę, i rośnie. — Przycisnęłam nasady dłoni do oczu. — To, co dobre, i to, co łatwe, to nie to samo. To musi wyjść na światło dzienne. Wszystko. Jak należy. Z Noriko Tanaka. Z udziałem prawa, przeprowadzonego łagodnie, z miłosierdziem, ale jednak prawa. Tylko w ten sposób Fiona uwolni się od tego raz na zawsze, i tylko w ten sposób Theo stanie się kimś więcej niż człowiekiem z przestępstwem zagrzebanym pod podłogą.</w:t>
-      </w:r>
-    </w:p>
-    <w:p/>
-    <w:p>
-      <w:r>
-        <w:t xml:space="preserve">— To trudniejsza droga — powiedział cicho Nick. — Szczególnie dla ciebie. Miasteczko pogrąży się w żałobie, Jess, a niektórzy będą żałować, że nie zostawiłaś tego w spokoju, i to ty sprowadziłaś na nich ten żal. Będą wiedzieć, że to ty.</w:t>
+        <w:t xml:space="preserve">— Nie mogę tego zakopać — powiedziałam. — Chcę tego. Bóg mi świadkiem, że chcę pójść tam dzisiaj wieczorem, zażegnać to wszystko szeptem i pozwolić każdemu zachować swoje życie. Ale jeśli tak zrobię, Fiona nigdy nie przestanie się bać, tak naprawdę. Theo nigdy nie będzie musiał stać się człowiekiem, któremu można przebaczyć. A zgnilizna zostałaby w murach tam, gdzie jej nie widzę, i rosłaby dalej. — Przycisnęłam nasady dłoni do oczu. — To, co dobre, i to, co łatwe, to nie to samo. To musi wyjść na światło dzienne. Wszystko. Jak należy. Z Noriko Tanaka. Z udziałem prawa, przeprowadzonego łagodnie, z miłosierdziem, ale jednak prawa. Tylko w ten sposób Fiona uwolni się od tego raz na zawsze, i tylko w ten sposób Theo stanie się kimś więcej niż człowiekiem z przestępstwem zagrzebanym pod podłogą.</w:t>
+      </w:r>
+    </w:p>
+    <w:p/>
+    <w:p>
+      <w:r>
+        <w:t xml:space="preserve">— To trudniejsza droga — powiedział cicho Nick. — Szczególnie dla ciebie. Miasteczko pogrąży się w żałobie, Jess, a niektórzy będą żałować, że nie zostawiłaś tego w spokoju, i to ty sprowadzisz na nich ten żal. Będą wiedzieć, że to ty.</w:t>
       </w:r>
     </w:p>
     <w:p/>
@@ -4446,7 +4446,7 @@
     <w:p/>
     <w:p>
       <w:r>
-        <w:t>Przez długą chwilę nie odzywał się. Jego dłonie miętosiły się wzajemnie na kolanach. I wtedy stało się to, o czym Noriko mówiła mi, że robi większość ludzi, gdy prawda zostaje wyłożona życzliwie i w całości. Przestał z tym walczyć. Jego twarz powoli skurczyła się jak stary papier. Pojawiły się łzy, a potem prawda, jednym strumieniem.</w:t>
+        <w:t xml:space="preserve">Przez długą chwilę nie odzywał się. Jego dłonie miętosiły się wzajemnie na kolanach. I wtedy stało się to, o czym Noriko mówiła mi, że robi większość ludzi, gdy prawda zostaje wyłożona życzliwie i w całości. Przestał z tym walczyć. Jego twarz powoli zmięła się jak stary papier. Pojawiły się łzy, a potem prawda, jednym strumieniem.</w:t>
       </w:r>
     </w:p>
     <w:p/>
@@ -4506,7 +4506,7 @@
     <w:p/>
     <w:p>
       <w:r>
-        <w:t xml:space="preserve">— Pani Vero — powiedziałam. — Theo miał kradzież. Ale liściki wiedziały, że gospoda została kupiona za pieniądze z broszy, a o tym nigdy nie było mowy w żadnym liście Blackburnów. To rejestr nieruchomości. Akt własności. A akt własności tej gospody leżał wczoraj rano poza swoją szufladą w pani koszyku do ponownego porządkowania, dotknięty, na biurku kobiety, która dwukrotnie powtórzyła mi, że nigdy nie zagląda do dokumentów leżących za jej plecami.</w:t>
+        <w:t xml:space="preserve">— Pani Vero — powiedziałam. — Theo miał w ręku tajemnicę kradzieży. Ale liściki wiedziały, że gospoda została kupiona za pieniądze z broszy, a o tym nigdy nie było mowy w żadnym liście Blackburnów. To rejestr nieruchomości. Akt własności. A akt własności tej gospody leżał wczoraj rano poza swoją szufladą w pani koszyku do ponownego porządkowania, niedawno przeglądany, na biurku kobiety, która dwukrotnie powtórzyła mi, że nigdy nie zagląda do dokumentów leżących za jej plecami.</w:t>
       </w:r>
     </w:p>
     <w:p/>
@@ -4518,7 +4518,7 @@
     <w:p/>
     <w:p>
       <w:r>
-        <w:t xml:space="preserve">— On miał kradzież. Pani miała akt własności. I miała pani nogi, pani Vero. On nie przeszedłby przez miasteczko niezauważony choćby o życie, wszyscy znają Thea, wszyscy go zatrzymują. Ale nikt nie mrugnie okiem na sekretarkę burmistrza zachodzącą do gospody w czasie festiwalu. Minęłam panią wtedy rano na schodach, z pani przepustkami parkingowymi. On nie mógłby zrobić tego sam. Potrzebował kogoś, kto potrafi poruszać się po miasteczku niewidziany. Tą osobą była pani.</w:t>
+        <w:t xml:space="preserve">— On miał w ręku tajemnicę kradzieży. Pani miała w ręku akt własności. I miała pani nogi, pani Vero. On nie przeszedłby przez miasteczko niezauważony, choćby od tego zależało jego życie, wszyscy znają Thea, wszyscy go zatrzymują. Ale nikt nie mrugnie okiem na sekretarkę burmistrza zachodzącą do gospody w czasie festiwalu. Minęłam panią wtedy rano na schodach, z pani przepustkami parkingowymi. On nie mógłby zrobić tego sam. Potrzebował kogoś, kto potrafi poruszać się po miasteczku niewidziany. Tą osobą była pani.</w:t>
       </w:r>
     </w:p>
     <w:p/>
@@ -4548,7 +4548,7 @@
     <w:p/>
     <w:p>
       <w:r>
-        <w:t>Spojrzała na Fionę, druzgocąco skruszona.</w:t>
+        <w:t xml:space="preserve">Spojrzała na Fionę, zdruzgotana.</w:t>
       </w:r>
     </w:p>
     <w:p/>
@@ -4625,7 +4625,7 @@
     <w:p/>
     <w:p>
       <w:r>
-        <w:t xml:space="preserve">Ustąpił ze stanowiska. Nie na chwilę, by po cichu wrócić na swój fotel, gdy miasteczko przestanie się wściekać. Zrezygnował z kierowania Towarzystwem Historycznym we Frost Falls, a zarząd, gdy tylko dowiedział się o wszystkim, przyjął tę rezygnację i to całkiem serio. Człowiek nie mógł szantażować sąsiada, wykorzystując zbiory i papier firmowy Towarzystwa, a potem zachować klucze do tego miejsca.</w:t>
+        <w:t xml:space="preserve">Ustąpił ze stanowiska. Nie na chwilę, by po cichu wrócić na swój fotel, gdy miasteczko przestanie się wściekać. Zrezygnował z kierowania Towarzystwem Historycznym we Frost Falls, a zarząd, gdy tylko dowiedział się o wszystkim, przyjął tę rezygnację i to całkiem serio. Człowiek nie mógł szantażować sąsiada, wykorzystując zbiory i papeterię Towarzystwa, a potem zachować klucze do tego miejsca.</w:t>
       </w:r>
     </w:p>
     <w:p/>
@@ -4637,7 +4637,7 @@
     <w:p/>
     <w:p>
       <w:r>
-        <w:t xml:space="preserve">— To więcej, niż na to zasługuję — powiedział Theo, kiedy mu o tym oznajmili. Rozpłakał się, a był to płacz człowieka, który szykował się na szubienicę, a zamiast tego dostarczono mu długą, wyboistą drogę.</w:t>
+        <w:t xml:space="preserve">— To więcej, niż na to zasługuję — powiedział Theo, kiedy mu o tym oznajmili. Rozpłakał się, a był to płacz człowieka, który szykował się na szubienicę, a zamiast tego dano mu długą, wyboistą drogę.</w:t>
       </w:r>
     </w:p>
     <w:p/>
@@ -4715,7 +4715,7 @@
     </w:p>
     <w:p>
       <w:r>
-        <w:t>To była miła propozycja, podyktowana szczerym sercem. Zresztą zadziałałaby w tym węższym ujęciu. Jeden czek i kłopoty finansowe Towarzystwa zniknęłyby — dokładnie te same kłopoty, które doprowadziły Thea niemal do szaleństwa i skłoniły do tego, co zrobił. Kawałek mnie, stojący zmęczony na tym zimnym ganku, chciał chwycić tę ofertę obiema rękami i uznać sprawę za zamkniętą.</w:t>
+        <w:t xml:space="preserve">To była miła propozycja, podyktowana szczerym sercem. Zresztą zadziałałaby w tym węższym ujęciu. Jeden czek i kłopoty finansowe Towarzystwa zniknęłyby — dokładnie te same kłopoty, które doprowadziły Thea niemal do szaleństwa i skłoniły do tego, co zrobił. Część mnie, stojącej zmęczonej na tym zimnym ganku, chciała chwycić tę ofertę obiema rękami i uznać sprawę za zamkniętą.</w:t>
       </w:r>
     </w:p>
     <w:p>
@@ -4755,7 +4755,7 @@
     </w:p>
     <w:p>
       <w:r>
-        <w:t>Wtedy pani Worthington się uśmiechnęła — po raz pierwszy tak naprawdę ciepło, od kiedy ich poznałam przez te wszystkie tygodnie — i położyła w rękawiczce dłoń na ramieniu męża.</w:t>
+        <w:t xml:space="preserve">Wtedy pani Worthington się uśmiechnęła — po raz pierwszy tak naprawdę ciepło, od kiedy ich poznałam przez te wszystkie tygodnie — i położyła dłoń w rękawiczce na ramieniu męża.</w:t>
       </w:r>
     </w:p>
     <w:p>
@@ -4765,7 +4765,7 @@
     </w:p>
     <w:p>
       <w:r>
-        <w:t xml:space="preserve">Więc zostawili to w ten sposób. Bez czeku. Zamiast tego z obietnicą, trzymaną w rezerwie na wypadek potrzeby. A Towarzystwo zostało dokładnie tam, gdzie było — na krawędzi przepaści, z dziurawym dachem i dogorywającym piecem, tylko że teraz nie został nawet Theo, który by o nie walczył, co czyniło ich położenie jeszcze bardziej ryzykownym niż wcześniej.</w:t>
+        <w:t xml:space="preserve">Więc zostawili to w ten sposób. Bez czeku. Zamiast tego z obietnicą, trzymaną w rezerwie na wypadek potrzeby. A Towarzystwo zostało dokładnie tam, gdzie było — na krawędzi przepaści, z dziurawym dachem i dogorywającym piecem, tylko że teraz nie został nawet Theo, który by o nie walczył, co czyniło jego położenie jeszcze bardziej ryzykownym niż wcześniej.</w:t>
       </w:r>
     </w:p>
     <w:p>
@@ -4790,7 +4790,7 @@
     </w:p>
     <w:p>
       <w:r>
-        <w:t>Przekonamy się o tym przed nowym rokiem.</w:t>
+        <w:t xml:space="preserve">Mieliśmy się o tym przekonać do Nowego Roku.</w:t>
       </w:r>
     </w:p>
     <w:p>
@@ -4850,7 +4850,7 @@
     </w:p>
     <w:p>
       <w:r>
-        <w:t>Przygotowałam się na rolę outsiderki, która zniszczyła porządnego człowieka. Bardziej niż w połowie spodziewałam się, że miasteczko się ode mnie odwróci, że będą żałować, iż nie zostawiłam tego w spokoju, że za każdym razem, gdy na mnie spojrzą, będą pamiętać, iż to ja wyciągnęłam Theo Husseina na światło dzienne i zasmuciłam to miejsce. I było trochę tego, tu i ówdzie, przez jakiś czas. Kilka osób, które nie potrafiły spojrzeć mi prosto w oczy, które milkły nieco, gdy wchodziłam do sklepu. Rozumiałam to i pozwalałam temu być. Nie naciskałam.</w:t>
+        <w:t xml:space="preserve">Przygotowałam się na rolę obcej, która zniszczyła porządnego człowieka. Bardziej niż w połowie spodziewałam się, że miasteczko się ode mnie odwróci, że będą żałować, iż nie zostawiłam tego w spokoju, że za każdym razem, gdy na mnie spojrzą, będą pamiętać, iż to ja wyciągnęłam Theo Husseina na światło dzienne i zasmuciłam to miejsce. I było trochę tego, tu i ówdzie, przez jakiś czas. Kilka osób, które nie potrafiły spojrzeć mi prosto w oczy, które milkły nieco, gdy wchodziłam do sklepu. Rozumiałam to i pozwalałam temu być. Nie naciskałam.</w:t>
       </w:r>
     </w:p>
     <w:p>
@@ -4936,12 +4936,12 @@
     </w:p>
     <w:p>
       <w:r>
-        <w:t>— W końcu znalazł połowę tropu prowadzącego do niej — kontynuowała Noriko — nawet jeśli szedł do tego okrężną drogą i w niewłaściwy sposób. Poświęcił trzydzieści lat na poznawanie miejsc, w których to miasteczko zakopywało rzeczy. Powinien tam być, gdy ta wychodzi na światło dzienne. To może być pierwsza porządna rzecz, w pobliżu której przyjdzie mu stanąć. A stanie w pobliżu czegoś dobrego, do czego nie może sobie przypisać zasług, może okazać się dokładnie tym lekarstwem, którego potrzebuje.</w:t>
-      </w:r>
-    </w:p>
-    <w:p>
-      <w:r>
-        <w:t>Ludzie mruczeli cicho, zgadzając się z tym, i tak zostało postanowione. Nie otworzymy jej.</w:t>
+        <w:t xml:space="preserve">— W końcu znalazł połowę tropu prowadzącego do niej — kontynuowała Noriko — nawet jeśli szedł do tego okrężną drogą i w niewłaściwy sposób. Poświęcił trzydzieści lat na poznawanie miejsc, w których to miasteczko zakopywało rzeczy. Powinien tam być, gdy ta wychodzi na światło dzienne. To może być pierwsza porządna rzecz, w pobliżu której znów przyjdzie mu stanąć. A stanie w pobliżu czegoś dobrego, do czego nie może sobie przypisać zasług, może okazać się dokładnie tym lekarstwem, którego potrzebuje.</w:t>
+      </w:r>
+    </w:p>
+    <w:p>
+      <w:r>
+        <w:t xml:space="preserve">Ludzie mruczeli cicho, zgadzając się z tym, i tak zostało postanowione. Nie mieliśmy jej otwierać.</w:t>
       </w:r>
     </w:p>
     <w:p>
@@ -4956,7 +4956,7 @@
     </w:p>
     <w:p>
       <w:r>
-        <w:t xml:space="preserve">— Ten zatrzask, pani Claus! — zawołał Bram, dobiegając bez tchu. — Znowu z niewłaściwej strony! Poddaję się, z tym wszystkim się poddaję, bestie idą tam, gdzie ludzie, a każda dusza w miasteczku jest tu dzisiaj na zewnątrz, co ma majster z tym począć, pytam się!</w:t>
+        <w:t xml:space="preserve">— Ta zasuwa, pani Claus! — zawołał Bram, dobiegając bez tchu. — Znowu z niewłaściwej strony! Poddaję się, z tym wszystkim się poddaję, bestie idą tam, gdzie ludzie, a każda dusza w miasteczku jest tu dzisiaj na zewnątrz, co ma majster z tym począć, pytam się!</w:t>
       </w:r>
     </w:p>
     <w:p>
@@ -4976,7 +4976,7 @@
     </w:p>
     <w:p>
       <w:r>
-        <w:t>Potem wróciliśmy do domu w blasku złotych świateł. Za naszymi plecami wiąz sterczał nad pustą dziurą, a na jego najniższych gałązkach wciąż lśnił szron. W nowym roku miasteczko otworzy skrzynkę, a Theo będzie tam, żeby to zobaczyć.</w:t>
+        <w:t xml:space="preserve">Potem wróciliśmy do domu w blasku złotych świateł. Za naszymi plecami wiąz sterczał nad pustą dziurą, a na jego najniższych gałązkach wciąż lśnił szron. W nowym roku miasteczko miało otworzyć skrzynkę, a Theo miał tam być, żeby to zobaczyć.</w:t>
       </w:r>
     </w:p>
     <w:p>
@@ -5111,12 +5111,12 @@
     </w:p>
     <w:p>
       <w:r>
-        <w:t xml:space="preserve">— Nie zasługuję na to, żeby tam być. Ale mówi, że mogę patrzeć. Po tym wszystkim wolno mi stać w pokoju, kiedy miasteczko otwiera swoje serce. Myślę o tym codziennie. Szczera prawda, to w dużej mierze trzyma mnie przy życiu.</w:t>
-      </w:r>
-    </w:p>
-    <w:p>
-      <w:r>
-        <w:t xml:space="preserve">— Więc trzymaj się tego — powiedziałam. — Krok po kroku. Tylko tyle ktoś od ciebie wymaga.</w:t>
+        <w:t xml:space="preserve">— Nie zasługuję na to, żeby tam być. Ale mówi, że mogę patrzeć. Po tym wszystkim wolno mi stać w pokoju, kiedy miasteczko otwiera swoje serce. Myślę o tym codziennie. Szczera prawda, to w dużej mierze pozwala mi się trzymać.</w:t>
+      </w:r>
+    </w:p>
+    <w:p>
+      <w:r>
+        <w:t xml:space="preserve">— Więc trzymaj się tego — powiedziałam. — Krok po kroku. Tylko tego wszyscy od ciebie oczekują.</w:t>
       </w:r>
     </w:p>
     <w:p>
@@ -5131,7 +5131,7 @@
     </w:p>
     <w:p>
       <w:r>
-        <w:t>Nick czekał na mnie, kiedy wróciłam do domu. Ujął moją dłoń w progu i bez słowa poprowadził przez zimne podwórko do warsztatu, po czym otworzył drzwi. Zbudowane przez niego palenisko żarzyło się w środku pomieszczenia, polne otoczaki były ciepłe i złote, a magia unosiła się nad pustym paleniskiem w powolnych kręgach. Było jej więcej niż wcześniej.</w:t>
+        <w:t xml:space="preserve">Nick czekał na mnie, kiedy wróciłam do domu. Ujął moją dłoń w progu i bez słowa poprowadził przez zimne podwórko do warsztatu, po czym otworzył drzwi. Zbudowane przez niego palenisko żarzyło się w środku pomieszczenia, polne otoczaki były ciepłe i złote, a magia unosiła się nad pustym rusztem w powolnych kręgach. Było jej więcej niż wcześniej.</w:t>
       </w:r>
     </w:p>
     <w:p>
@@ -5141,12 +5141,12 @@
     </w:p>
     <w:p>
       <w:r>
-        <w:t xml:space="preserve">— Kawałek po kawałku. Początek. — Objął mnie ramieniem. — Jeszcze nie wszystko, jeszcze nie na stałe. Potrzeba na to lat pracy, żeby zbudować palenisko dość wielkie, by pomieścić całą magię świąt. Ale to już ruszyło, Jess.</w:t>
-      </w:r>
-    </w:p>
-    <w:p>
-      <w:r>
-        <w:t xml:space="preserve">Przytuliłam się do niego, patrząc, jak złote kręgi wolno krążą nad rusztem, i myślałam o nadchodzącej zimie. Towarzystwo wciąż na krawędzi — miało zostać uratowane we właściwy sposób albo wcale — a przed nami cały sezon kiermaszy i upartej, drobnej szczodrobliwości, zanim ktokolwiek cokolwiek się dowie. Miedziana skrzynka zamknięta w przednim pokoju Towarzystwa aż do Nowego Roku. Vera i Theo, oboje przemierzający swoje długie drogi powrotne, krok po trudnym kroku. Magia, która już się osadzała, choć jeszcze nie na dobre, wciąż sypiąca iskrami wokół lamp i zamków w całym miasteczku. Tyle rzeczy wciąż niedokończonych. Tyle pracy przed nami.</w:t>
+        <w:t xml:space="preserve">— Jej odrobina. Dopiero początek. — Objął mnie ramieniem. — Jeszcze nie wszystko, jeszcze nie na stałe. Potrzeba na to lat pracy, żeby zbudować palenisko dość wielkie, by pomieścić całą magię świąt. Ale to już ruszyło, Jess.</w:t>
+      </w:r>
+    </w:p>
+    <w:p>
+      <w:r>
+        <w:t xml:space="preserve">Przytuliłam się do niego, patrząc, jak złote kręgi wolno krążą nad rusztem, i myślałam o nadchodzącej zimie. Towarzystwo wciąż na krawędzi — miało zostać uratowane we właściwy sposób albo wcale — a przed nami cały sezon kiermaszy i upartej, drobnej szczodrobliwości, zanim ktokolwiek cokolwiek się dowie. Miedziana skrzynka zamknięta w przednim pokoju Towarzystwa aż do Nowego Roku. Vera i Theo, oboje przemierzający swoje długie drogi powrotne, krok po trudnym kroku. Magia, która już się osadzała, choć jeszcze nie na dobre, wciąż sypiąca iskrami wokół lamp i zasuw w całym miasteczku. Tyle rzeczy wciąż niedokończonych. Tyle pracy przed nami.</w:t>
       </w:r>
     </w:p>
     <w:p>
@@ -5166,7 +5166,7 @@
     </w:p>
     <w:p>
       <w:r>
-        <w:t>Weszliśmy razem z zimnej nocy. Pip wyprzedziła nas do drzwi kuchni i stanęła tam, domagając się wpuszczenia do ciepła, a za naszymi plecami, po drugiej stronie podwórka, w warsztacie wciąż żarzyło się palenisko.</w:t>
+        <w:t xml:space="preserve">Weszliśmy razem ze złotej nocy. Pip wyprzedziła nas do drzwi kuchni i stanęła tam, domagając się wpuszczenia do ciepła, a za naszymi plecami, po drugiej stronie podwórka, w warsztacie wciąż żarzyło się palenisko.</w:t>
       </w:r>
     </w:p>
     <w:p/>
@@ -5381,7 +5381,7 @@
     </w:p>
     <w:p>
       <w:r>
-        <w:t xml:space="preserve">Wtedy dotarło do mnie, gdy tak układałam gałązkę na gałązce, jak daleko zaszłam, żeby tu siedzieć. Nie chodziło o kilometry. Było ich całkiem sporo, ale nie o nie mi szło. Niedawno byłam w Frost Falls nowicjuszką. Kobietą z Bieguna Północnego ze sławnym mężem i dziwaczniejszym pingwinem. Ludzie byli dla mnie życzliwi tak, jak miasto bywa życzliwe wobec gościa — to znaczy zrobili miejsce i obserwowali, co z tym miejscem zrobię. A teraz Olivia próbowała ukraść mój sposób wiązania wieńca. Pies Marthy spał przy moim krześle równie spokojnie co przy jej. Nikt mi już niczego nie tłumaczył. Zakładano, że wiem. Zapracowałam na to szybko, przez ciężką jesień, zagubionego psa i kapsułę czasu.</w:t>
+        <w:t xml:space="preserve">Wtedy dotarło do mnie, gdy tak układałam gałązkę na gałązce, jak daleko zaszłam, żeby tu siedzieć. Nie chodziło o kilometry. Było ich całkiem sporo, ale nie o nie mi szło. Niedawno byłam w Frost Falls nowicjuszką. Kobietą z Bieguna Północnego ze sławnym mężem i dziwaczniejszym pingwinem. Ludzie byli dla mnie życzliwi tak, jak miasteczko bywa życzliwe wobec gościa — to znaczy zrobili miejsce i obserwowali, co z tym miejscem zrobię. A teraz Olivia próbowała ukraść mój sposób wiązania wieńca. Pies Marthy spał przy moim krześle równie spokojnie co przy jej. Nikt mi już niczego nie tłumaczył. Zakładano, że wiem. Zapracowałam na to szybko, przez ciężką jesień, zagubionego psa i kapsułę czasu.</w:t>
       </w:r>
     </w:p>
     <w:p>
@@ -5476,7 +5476,7 @@
     </w:p>
     <w:p>
       <w:r>
-        <w:t xml:space="preserve">— Brązowym papierem, od środka szkła. Tak się robi, kiedy urządzasz wnętrze i nie chcesz, żeby miasto ci się gapiło na ręce. — Claire wzruszyła ramionami. — Żadnego szyldu. Na tablicy pozwoleń też jeszcze nie ma nazwy, sprawdzałam. Ale w zaułku stoi kontener na śmieci, a w sobotę stała tam furgonetka, a człowiek nie wynajmuje kontenera, jeśli nie sprząta przestrzeni.</w:t>
+        <w:t xml:space="preserve">— Brązowym papierem, od środka szkła. Tak się robi, kiedy urządzasz wnętrze i nie chcesz, żeby miasteczko ci się gapiło na ręce. — Claire wzruszyła ramionami. — Żadnego szyldu. Na tablicy pozwoleń też jeszcze nie ma nazwy, sprawdzałam. Ale w zaułku stoi kontener na śmieci, a w sobotę stała tam furgonetka, a człowiek nie wynajmuje kontenera, jeśli nie sprząta przestrzeni.</w:t>
       </w:r>
     </w:p>
     <w:p>
@@ -5511,7 +5511,7 @@
     </w:p>
     <w:p>
       <w:r>
-        <w:t xml:space="preserve">Skwer rozciągał się naprzeciwko Yarn Tales, szerokie, białe błonie z muszlą koncertową na jednym końcu i pomnikiem poległych na drugim. Uczniowie szkoły zbudowali wzdłuż niego rzędami bałwany podczas pierwszego porządnego śniegu. Trzy sztuki, grube i przekrzywione, ukoronowane tym, co dzieciaki zdołały wyszperać. Wczoraj, jak zauważyła Ellie, stały zwrócone w stronę ulicy, z oczami z węgielków i towarzyskim wyrazem, odprowadzając wzrokiem ruch uliczny, jak to bałwany mają w zwyczaju. Sama przechodziłam obok nich poprzedniego wieczoru. Zwrócone były ku ulicy.</w:t>
+        <w:t xml:space="preserve">Skwer rozciągał się naprzeciwko Yarn Tales, szerokie, białe błonie z muszlą koncertową na jednym końcu i pomnikiem poległych na drugim. Uczniowie szkoły zbudowali wzdłuż niego rząd bałwanów podczas pierwszego porządnego śniegu. Trzy sztuki, grube i przekrzywione, ukoronowane tym, co dzieciaki zdołały wyszperać. Wczoraj, jak zauważyła Ellie, stały zwrócone w stronę ulicy, z oczami z węgielków i towarzyskim wyrazem, odprowadzając wzrokiem ruch uliczny, jak to bałwany mają w zwyczaju. Sama przechodziłam obok nich poprzedniego wieczoru. Zwrócone były ku ulicy.</w:t>
       </w:r>
     </w:p>
     <w:p>

</xml_diff>